<commit_message>
Media request - redo graphic Fixes #12
</commit_message>
<xml_diff>
--- a/docs/PSYC-339.docx
+++ b/docs/PSYC-339.docx
@@ -7,13 +7,7 @@
         <w:pStyle w:val="Title"/>
       </w:pPr>
       <w:r>
-        <w:t xml:space="preserve">PSYC</w:t>
-      </w:r>
-      <w:r>
-        <w:t xml:space="preserve"> </w:t>
-      </w:r>
-      <w:r>
-        <w:t xml:space="preserve">339</w:t>
+        <w:t xml:space="preserve">PSYC 339</w:t>
       </w:r>
     </w:p>
     <w:p>
@@ -21,13 +15,7 @@
         <w:pStyle w:val="Author"/>
       </w:pPr>
       <w:r>
-        <w:t xml:space="preserve">Emily</w:t>
-      </w:r>
-      <w:r>
-        <w:t xml:space="preserve"> </w:t>
-      </w:r>
-      <w:r>
-        <w:t xml:space="preserve">Verseveldt</w:t>
+        <w:t xml:space="preserve">Emily Verseveldt</w:t>
       </w:r>
     </w:p>
     <w:p>
@@ -35,19 +23,7 @@
         <w:pStyle w:val="Date"/>
       </w:pPr>
       <w:r>
-        <w:t xml:space="preserve">Sep</w:t>
-      </w:r>
-      <w:r>
-        <w:t xml:space="preserve"> </w:t>
-      </w:r>
-      <w:r>
-        <w:t xml:space="preserve">30,</w:t>
-      </w:r>
-      <w:r>
-        <w:t xml:space="preserve"> </w:t>
-      </w:r>
-      <w:r>
-        <w:t xml:space="preserve">2025</w:t>
+        <w:t xml:space="preserve">Jan 15, 2026</w:t>
       </w:r>
     </w:p>
     <w:sdt>
@@ -63,19 +39,7 @@
             <w:pStyle w:val="TOCHeading"/>
           </w:pPr>
           <w:r>
-            <w:t xml:space="preserve">Table</w:t>
-          </w:r>
-          <w:r>
-            <w:t xml:space="preserve"> </w:t>
-          </w:r>
-          <w:r>
-            <w:t xml:space="preserve">of</w:t>
-          </w:r>
-          <w:r>
-            <w:t xml:space="preserve"> </w:t>
-          </w:r>
-          <w:r>
-            <w:t xml:space="preserve">contents</w:t>
+            <w:t xml:space="preserve">Table of contents</w:t>
           </w:r>
         </w:p>
         <w:p>
@@ -900,13 +864,7 @@
         <w:t xml:space="preserve"> </w:t>
       </w:r>
       <w:r>
-        <w:t xml:space="preserve">“</w:t>
-      </w:r>
-      <w:r>
-        <w:t xml:space="preserve">Questions to Consider</w:t>
-      </w:r>
-      <w:r>
-        <w:t xml:space="preserve">”</w:t>
+        <w:t xml:space="preserve">“Questions to Consider”</w:t>
       </w:r>
       <w:r>
         <w:t xml:space="preserve"> </w:t>
@@ -1808,23 +1766,7 @@
             <w:i/>
             <w:iCs/>
           </w:rPr>
-          <w:t xml:space="preserve">“</w:t>
-        </w:r>
-        <w:r>
-          <w:rPr>
-            <w:rStyle w:val="Hyperlink"/>
-            <w:i/>
-            <w:iCs/>
-          </w:rPr>
-          <w:t xml:space="preserve">The Body Keeps the Score</w:t>
-        </w:r>
-        <w:r>
-          <w:rPr>
-            <w:rStyle w:val="Hyperlink"/>
-            <w:i/>
-            <w:iCs/>
-          </w:rPr>
-          <w:t xml:space="preserve">”</w:t>
+          <w:t xml:space="preserve">“The Body Keeps the Score”</w:t>
         </w:r>
         <w:r>
           <w:rPr>
@@ -2692,13 +2634,7 @@
         <w:t xml:space="preserve"> </w:t>
       </w:r>
       <w:r>
-        <w:t xml:space="preserve">“</w:t>
-      </w:r>
-      <w:r>
-        <w:t xml:space="preserve">why</w:t>
-      </w:r>
-      <w:r>
-        <w:t xml:space="preserve">”</w:t>
+        <w:t xml:space="preserve">“why”</w:t>
       </w:r>
       <w:r>
         <w:t xml:space="preserve"> </w:t>
@@ -2802,23 +2738,7 @@
             <w:i/>
             <w:iCs/>
           </w:rPr>
-          <w:t xml:space="preserve">“</w:t>
-        </w:r>
-        <w:r>
-          <w:rPr>
-            <w:rStyle w:val="Hyperlink"/>
-            <w:i/>
-            <w:iCs/>
-          </w:rPr>
-          <w:t xml:space="preserve">The Body Keeps the Score</w:t>
-        </w:r>
-        <w:r>
-          <w:rPr>
-            <w:rStyle w:val="Hyperlink"/>
-            <w:i/>
-            <w:iCs/>
-          </w:rPr>
-          <w:t xml:space="preserve">”</w:t>
+          <w:t xml:space="preserve">“The Body Keeps the Score”</w:t>
         </w:r>
         <w:r>
           <w:rPr>
@@ -2896,13 +2816,7 @@
         <w:pStyle w:val="BlockText"/>
       </w:pPr>
       <w:r>
-        <w:t xml:space="preserve">“</w:t>
-      </w:r>
-      <w:r>
-        <w:t xml:space="preserve">When you can’t be fully here, you go to the places where you did feel alive—even if those places are filled with horror and misery</w:t>
-      </w:r>
-      <w:r>
-        <w:t xml:space="preserve">”</w:t>
+        <w:t xml:space="preserve">“When you can’t be fully here, you go to the places where you did feel alive—even if those places are filled with horror and misery”</w:t>
       </w:r>
       <w:r>
         <w:t xml:space="preserve"> </w:t>
@@ -2973,13 +2887,7 @@
         <w:t xml:space="preserve"> </w:t>
       </w:r>
       <w:r>
-        <w:t xml:space="preserve">“</w:t>
-      </w:r>
-      <w:r>
-        <w:t xml:space="preserve">neurons that fire together, wire together</w:t>
-      </w:r>
-      <w:r>
-        <w:t xml:space="preserve">”</w:t>
+        <w:t xml:space="preserve">“neurons that fire together, wire together”</w:t>
       </w:r>
       <w:r>
         <w:t xml:space="preserve"> </w:t>
@@ -3051,13 +2959,7 @@
         <w:t xml:space="preserve"> </w:t>
       </w:r>
       <w:r>
-        <w:t xml:space="preserve">“</w:t>
-      </w:r>
-      <w:r>
-        <w:t xml:space="preserve">online</w:t>
-      </w:r>
-      <w:r>
-        <w:t xml:space="preserve">”</w:t>
+        <w:t xml:space="preserve">“online”</w:t>
       </w:r>
       <w:r>
         <w:t xml:space="preserve"> </w:t>
@@ -3168,13 +3070,7 @@
         <w:t xml:space="preserve"> </w:t>
       </w:r>
       <w:r>
-        <w:t xml:space="preserve">“</w:t>
-      </w:r>
-      <w:r>
-        <w:t xml:space="preserve">don’t ask why the addiction, but why the pain.</w:t>
-      </w:r>
-      <w:r>
-        <w:t xml:space="preserve">”</w:t>
+        <w:t xml:space="preserve">“don’t ask why the addiction, but why the pain.”</w:t>
       </w:r>
       <w:r>
         <w:t xml:space="preserve"> </w:t>
@@ -3507,10 +3403,7 @@
         <w:pStyle w:val="BlockText"/>
       </w:pPr>
       <w:r>
-        <w:t xml:space="preserve">“</w:t>
-      </w:r>
-      <w:r>
-        <w:t xml:space="preserve">Courtois</w:t>
+        <w:t xml:space="preserve">“Courtois</w:t>
       </w:r>
       <w:r>
         <w:t xml:space="preserve"> </w:t>
@@ -3554,10 +3447,7 @@
         <w:t xml:space="preserve"> </w:t>
       </w:r>
       <w:r>
-        <w:t xml:space="preserve">form of trauma, occurring primarily within familial or intimate relationships … requiring survival to take precedence over normal psychobiological development</w:t>
-      </w:r>
-      <w:r>
-        <w:t xml:space="preserve">”</w:t>
+        <w:t xml:space="preserve">form of trauma, occurring primarily within familial or intimate relationships … requiring survival to take precedence over normal psychobiological development”</w:t>
       </w:r>
       <w:r>
         <w:t xml:space="preserve"> </w:t>
@@ -3580,10 +3470,7 @@
         <w:t xml:space="preserve"> </w:t>
       </w:r>
       <w:r>
-        <w:t xml:space="preserve">“</w:t>
-      </w:r>
-      <w:r>
-        <w:t xml:space="preserve">a</w:t>
+        <w:t xml:space="preserve">“a</w:t>
       </w:r>
       <w:r>
         <w:t xml:space="preserve"> </w:t>
@@ -4071,13 +3958,7 @@
         <w:t xml:space="preserve"> </w:t>
       </w:r>
       <w:r>
-        <w:t xml:space="preserve">“</w:t>
-      </w:r>
-      <w:r>
-        <w:t xml:space="preserve">know thyself</w:t>
-      </w:r>
-      <w:r>
-        <w:t xml:space="preserve">”</w:t>
+        <w:t xml:space="preserve">“know thyself”</w:t>
       </w:r>
       <w:r>
         <w:t xml:space="preserve"> </w:t>
@@ -4407,13 +4288,7 @@
         <w:t xml:space="preserve"> </w:t>
       </w:r>
       <w:r>
-        <w:t xml:space="preserve">“</w:t>
-      </w:r>
-      <w:r>
-        <w:t xml:space="preserve">good house–bad house</w:t>
-      </w:r>
-      <w:r>
-        <w:t xml:space="preserve">”</w:t>
+        <w:t xml:space="preserve">“good house–bad house”</w:t>
       </w:r>
       <w:r>
         <w:t xml:space="preserve"> </w:t>
@@ -4447,13 +4322,7 @@
         <w:t xml:space="preserve"> </w:t>
       </w:r>
       <w:r>
-        <w:t xml:space="preserve">“</w:t>
-      </w:r>
-      <w:r>
-        <w:t xml:space="preserve">watchtower of the mind</w:t>
-      </w:r>
-      <w:r>
-        <w:t xml:space="preserve">”</w:t>
+        <w:t xml:space="preserve">“watchtower of the mind”</w:t>
       </w:r>
       <w:r>
         <w:t xml:space="preserve"> </w:t>
@@ -4952,13 +4821,7 @@
         <w:t xml:space="preserve"> </w:t>
       </w:r>
       <w:r>
-        <w:t xml:space="preserve">“</w:t>
-      </w:r>
-      <w:r>
-        <w:t xml:space="preserve">In the Realm of Hungry Ghosts.</w:t>
-      </w:r>
-      <w:r>
-        <w:t xml:space="preserve">”</w:t>
+        <w:t xml:space="preserve">“In the Realm of Hungry Ghosts.”</w:t>
       </w:r>
       <w:r>
         <w:t xml:space="preserve"> </w:t>
@@ -4970,13 +4833,7 @@
         <w:t xml:space="preserve"> </w:t>
       </w:r>
       <w:r>
-        <w:t xml:space="preserve">“</w:t>
-      </w:r>
-      <w:r>
-        <w:t xml:space="preserve">Don’t ask why the addiction, ask why the pain.</w:t>
-      </w:r>
-      <w:r>
-        <w:t xml:space="preserve">”</w:t>
+        <w:t xml:space="preserve">“Don’t ask why the addiction, ask why the pain.”</w:t>
       </w:r>
     </w:p>
     <w:p>
@@ -5090,13 +4947,7 @@
         <w:t xml:space="preserve"> </w:t>
       </w:r>
       <w:r>
-        <w:t xml:space="preserve">“</w:t>
-      </w:r>
-      <w:r>
-        <w:t xml:space="preserve">Not why the addiction, but why the pain?</w:t>
-      </w:r>
-      <w:r>
-        <w:t xml:space="preserve">”</w:t>
+        <w:t xml:space="preserve">“Not why the addiction, but why the pain?”</w:t>
       </w:r>
     </w:p>
     <w:p>
@@ -5823,13 +5674,7 @@
         <w:t xml:space="preserve"> </w:t>
       </w:r>
       <w:r>
-        <w:t xml:space="preserve">“</w:t>
-      </w:r>
-      <w:r>
-        <w:t xml:space="preserve">Rat Park</w:t>
-      </w:r>
-      <w:r>
-        <w:t xml:space="preserve">”</w:t>
+        <w:t xml:space="preserve">“Rat Park”</w:t>
       </w:r>
       <w:r>
         <w:t xml:space="preserve">?</w:t>
@@ -6321,13 +6166,7 @@
         <w:t xml:space="preserve"> </w:t>
       </w:r>
       <w:r>
-        <w:t xml:space="preserve">“</w:t>
-      </w:r>
-      <w:r>
-        <w:t xml:space="preserve">As a result of life events, chemicals attach themselves to DNA and direct gene activities</w:t>
-      </w:r>
-      <w:r>
-        <w:t xml:space="preserve">”</w:t>
+        <w:t xml:space="preserve">“As a result of life events, chemicals attach themselves to DNA and direct gene activities”</w:t>
       </w:r>
       <w:r>
         <w:t xml:space="preserve"> </w:t>
@@ -6498,13 +6337,7 @@
         <w:t xml:space="preserve"> </w:t>
       </w:r>
       <w:r>
-        <w:t xml:space="preserve">“</w:t>
-      </w:r>
-      <w:r>
-        <w:t xml:space="preserve">replace</w:t>
-      </w:r>
-      <w:r>
-        <w:t xml:space="preserve">”</w:t>
+        <w:t xml:space="preserve">“replace”</w:t>
       </w:r>
       <w:r>
         <w:t xml:space="preserve"> </w:t>
@@ -6890,13 +6723,7 @@
         <w:t xml:space="preserve"> </w:t>
       </w:r>
       <w:r>
-        <w:t xml:space="preserve">“</w:t>
-      </w:r>
-      <w:r>
-        <w:t xml:space="preserve">programmed</w:t>
-      </w:r>
-      <w:r>
-        <w:t xml:space="preserve">”</w:t>
+        <w:t xml:space="preserve">“programmed”</w:t>
       </w:r>
       <w:r>
         <w:t xml:space="preserve"> </w:t>
@@ -7080,13 +6907,7 @@
         <w:t xml:space="preserve"> </w:t>
       </w:r>
       <w:r>
-        <w:t xml:space="preserve">“</w:t>
-      </w:r>
-      <w:r>
-        <w:t xml:space="preserve">compassionate inquiry,</w:t>
-      </w:r>
-      <w:r>
-        <w:t xml:space="preserve">”</w:t>
+        <w:t xml:space="preserve">“compassionate inquiry,”</w:t>
       </w:r>
       <w:r>
         <w:t xml:space="preserve"> </w:t>
@@ -7282,14 +7103,19 @@
       <w:pPr>
         <w:pStyle w:val="BodyText"/>
       </w:pPr>
-      <w:r>
-        <w:rPr>
-          <w:color w:val="7f1caa"/>
+    </w:p>
+    <w:p>
+      <w:pPr>
+        <w:pStyle w:val="BodyText"/>
+      </w:pPr>
+      <w:r>
+        <w:rPr>
+          <w:color w:val="749fa3"/>
           <w:sz w:val="24"/>
           <w:szCs w:val="24"/>
           <w:b/>
         </w:rPr>
-        <w:t xml:space="preserve">&lt;Begin figure&gt;</w:t>
+        <w:t xml:space="preserve">&lt;Begin dec-image&gt;</w:t>
       </w:r>
     </w:p>
     <w:p>
@@ -7302,14 +7128,14 @@
           <w:szCs w:val="16"/>
           <w:b/>
         </w:rPr>
-        <w:t xml:space="preserve">Figure ID: </w:t>
+        <w:t xml:space="preserve">Alt Text: </w:t>
       </w:r>
       <w:r>
         <w:rPr>
           <w:sz w:val="16"/>
           <w:szCs w:val="16"/>
         </w:rPr>
-        <w:t xml:space="preserve">#fig-image-u2</w:t>
+        <w:t xml:space="preserve"/>
       </w:r>
       <w:r>
         <w:br/>
@@ -7320,14 +7146,14 @@
           <w:szCs w:val="16"/>
           <w:b/>
         </w:rPr>
-        <w:t xml:space="preserve">Caption: </w:t>
+        <w:t xml:space="preserve">Has Lightbox: </w:t>
       </w:r>
       <w:r>
         <w:rPr>
           <w:sz w:val="16"/>
           <w:szCs w:val="16"/>
         </w:rPr>
-        <w:t xml:space="preserve">Two Areas Highlighted by EFFT in Mental Health</w:t>
+        <w:t xml:space="preserve">no</w:t>
       </w:r>
       <w:r>
         <w:br/>
@@ -7338,302 +7164,161 @@
           <w:szCs w:val="16"/>
           <w:b/>
         </w:rPr>
-        <w:t xml:space="preserve">Columns: </w:t>
+        <w:t xml:space="preserve">Source Text: </w:t>
+      </w:r>
+      <w:r>
+        <w:br/>
       </w:r>
       <w:r>
         <w:rPr>
           <w:sz w:val="16"/>
           <w:szCs w:val="16"/>
+          <w:b/>
+        </w:rPr>
+        <w:t xml:space="preserve">Source URL: </w:t>
+      </w:r>
+      <w:r>
+        <w:rPr>
+          <w:sz w:val="16"/>
+          <w:szCs w:val="16"/>
         </w:rPr>
         <w:t xml:space="preserve"/>
       </w:r>
-    </w:p>
-    <w:p>
-      <w:pPr>
-        <w:pStyle w:val="BodyText"/>
-      </w:pPr>
-      <w:r>
-        <w:rPr>
-          <w:color w:val="f4a6d2"/>
+      <w:r>
+        <w:br/>
+      </w:r>
+      <w:r>
+        <w:rPr>
+          <w:sz w:val="16"/>
+          <w:szCs w:val="16"/>
+          <w:b/>
+        </w:rPr>
+        <w:t xml:space="preserve">Author: </w:t>
+      </w:r>
+      <w:r>
+        <w:br/>
+      </w:r>
+      <w:r>
+        <w:rPr>
+          <w:sz w:val="16"/>
+          <w:szCs w:val="16"/>
+          <w:b/>
+        </w:rPr>
+        <w:t xml:space="preserve">Author URL: </w:t>
+      </w:r>
+      <w:r>
+        <w:rPr>
+          <w:sz w:val="16"/>
+          <w:szCs w:val="16"/>
+        </w:rPr>
+        <w:t xml:space="preserve"/>
+      </w:r>
+      <w:r>
+        <w:br/>
+      </w:r>
+      <w:r>
+        <w:rPr>
+          <w:sz w:val="16"/>
+          <w:szCs w:val="16"/>
+          <w:b/>
+        </w:rPr>
+        <w:t xml:space="preserve">Copyright: </w:t>
+      </w:r>
+      <w:r>
+        <w:br/>
+      </w:r>
+      <w:r>
+        <w:rPr>
+          <w:sz w:val="16"/>
+          <w:szCs w:val="16"/>
+          <w:b/>
+        </w:rPr>
+        <w:t xml:space="preserve">License Text: </w:t>
+      </w:r>
+      <w:r>
+        <w:br/>
+      </w:r>
+      <w:r>
+        <w:rPr>
+          <w:sz w:val="16"/>
+          <w:szCs w:val="16"/>
+          <w:b/>
+        </w:rPr>
+        <w:t xml:space="preserve">License URL: </w:t>
+      </w:r>
+      <w:r>
+        <w:rPr>
+          <w:sz w:val="16"/>
+          <w:szCs w:val="16"/>
+        </w:rPr>
+        <w:t xml:space="preserve"/>
+      </w:r>
+    </w:p>
+    <w:p>
+      <w:pPr>
+        <w:pStyle w:val="BodyText"/>
+      </w:pPr>
+      <w:r>
+        <w:drawing>
+          <wp:inline>
+            <wp:extent cx="5074920" cy="8823960"/>
+            <wp:effectExtent b="0" l="0" r="0" t="0"/>
+            <wp:docPr descr="" title="" id="55" name="Picture"/>
+            <a:graphic>
+              <a:graphicData uri="http://schemas.openxmlformats.org/drawingml/2006/picture">
+                <pic:pic>
+                  <pic:nvPicPr>
+                    <pic:cNvPr descr="u2_files/figure-docx/mermaid-figure-1.png" id="56" name="Picture"/>
+                    <pic:cNvPicPr>
+                      <a:picLocks noChangeArrowheads="1" noChangeAspect="1"/>
+                    </pic:cNvPicPr>
+                  </pic:nvPicPr>
+                  <pic:blipFill>
+                    <a:blip r:embed="rId54"/>
+                    <a:stretch>
+                      <a:fillRect/>
+                    </a:stretch>
+                  </pic:blipFill>
+                  <pic:spPr bwMode="auto">
+                    <a:xfrm>
+                      <a:off x="0" y="0"/>
+                      <a:ext cx="5074920" cy="8823960"/>
+                    </a:xfrm>
+                    <a:prstGeom prst="rect">
+                      <a:avLst/>
+                    </a:prstGeom>
+                    <a:noFill/>
+                    <a:ln w="9525">
+                      <a:noFill/>
+                      <a:headEnd/>
+                      <a:tailEnd/>
+                    </a:ln>
+                  </pic:spPr>
+                </pic:pic>
+              </a:graphicData>
+            </a:graphic>
+          </wp:inline>
+        </w:drawing>
+      </w:r>
+    </w:p>
+    <w:p>
+      <w:pPr>
+        <w:pStyle w:val="BodyText"/>
+      </w:pPr>
+      <w:r>
+        <w:rPr>
+          <w:color w:val="749fa3"/>
           <w:sz w:val="24"/>
           <w:szCs w:val="24"/>
           <w:b/>
         </w:rPr>
-        <w:t xml:space="preserve">&lt;Begin fig-image&gt;</w:t>
-      </w:r>
-    </w:p>
-    <w:p>
-      <w:pPr>
-        <w:pStyle w:val="BodyText"/>
-      </w:pPr>
-      <w:r>
-        <w:rPr>
-          <w:sz w:val="16"/>
-          <w:szCs w:val="16"/>
-          <w:b/>
-        </w:rPr>
-        <w:t xml:space="preserve">Figure ID: </w:t>
-      </w:r>
-      <w:r>
-        <w:rPr>
-          <w:sz w:val="16"/>
-          <w:szCs w:val="16"/>
-        </w:rPr>
-        <w:t xml:space="preserve">u2_1</w:t>
-      </w:r>
-      <w:r>
-        <w:br/>
-      </w:r>
-      <w:r>
-        <w:rPr>
-          <w:sz w:val="16"/>
-          <w:szCs w:val="16"/>
-          <w:b/>
-        </w:rPr>
-        <w:t xml:space="preserve">Caption: </w:t>
-      </w:r>
-      <w:r>
-        <w:rPr>
-          <w:sz w:val="16"/>
-          <w:szCs w:val="16"/>
-        </w:rPr>
-        <w:t xml:space="preserve"/>
-      </w:r>
-      <w:r>
-        <w:br/>
-      </w:r>
-      <w:r>
-        <w:rPr>
-          <w:sz w:val="16"/>
-          <w:szCs w:val="16"/>
-          <w:b/>
-        </w:rPr>
-        <w:t xml:space="preserve">Alt Text: </w:t>
-      </w:r>
-      <w:r>
-        <w:rPr>
-          <w:sz w:val="16"/>
-          <w:szCs w:val="16"/>
-        </w:rPr>
-        <w:t xml:space="preserve">EFFT: Family Environment and Emotional Processing</w:t>
-      </w:r>
-      <w:r>
-        <w:br/>
-      </w:r>
-      <w:r>
-        <w:rPr>
-          <w:sz w:val="16"/>
-          <w:szCs w:val="16"/>
-          <w:b/>
-        </w:rPr>
-        <w:t xml:space="preserve">Has Lightbox: </w:t>
-      </w:r>
-      <w:r>
-        <w:rPr>
-          <w:sz w:val="16"/>
-          <w:szCs w:val="16"/>
-        </w:rPr>
-        <w:t xml:space="preserve">yes</w:t>
-      </w:r>
-      <w:r>
-        <w:br/>
-      </w:r>
-      <w:r>
-        <w:rPr>
-          <w:sz w:val="16"/>
-          <w:szCs w:val="16"/>
-          <w:b/>
-        </w:rPr>
-        <w:t xml:space="preserve">Source Text: </w:t>
-      </w:r>
-      <w:r>
-        <w:br/>
-      </w:r>
-      <w:r>
-        <w:rPr>
-          <w:sz w:val="16"/>
-          <w:szCs w:val="16"/>
-          <w:b/>
-        </w:rPr>
-        <w:t xml:space="preserve">Source URL: </w:t>
-      </w:r>
-      <w:r>
-        <w:rPr>
-          <w:sz w:val="16"/>
-          <w:szCs w:val="16"/>
-        </w:rPr>
-        <w:t xml:space="preserve"/>
-      </w:r>
-      <w:r>
-        <w:br/>
-      </w:r>
-      <w:r>
-        <w:rPr>
-          <w:sz w:val="16"/>
-          <w:szCs w:val="16"/>
-          <w:b/>
-        </w:rPr>
-        <w:t xml:space="preserve">Author: </w:t>
-      </w:r>
-      <w:r>
-        <w:rPr>
-          <w:sz w:val="16"/>
-          <w:szCs w:val="16"/>
-        </w:rPr>
-        <w:t xml:space="preserve">Jasmine Pang</w:t>
-      </w:r>
-      <w:r>
-        <w:br/>
-      </w:r>
-      <w:r>
-        <w:rPr>
-          <w:sz w:val="16"/>
-          <w:szCs w:val="16"/>
-          <w:b/>
-        </w:rPr>
-        <w:t xml:space="preserve">Author URL: </w:t>
-      </w:r>
-      <w:r>
-        <w:rPr>
-          <w:sz w:val="16"/>
-          <w:szCs w:val="16"/>
-        </w:rPr>
-        <w:t xml:space="preserve"/>
-      </w:r>
-      <w:r>
-        <w:br/>
-      </w:r>
-      <w:r>
-        <w:rPr>
-          <w:sz w:val="16"/>
-          <w:szCs w:val="16"/>
-          <w:b/>
-        </w:rPr>
-        <w:t xml:space="preserve">Copyright: </w:t>
-      </w:r>
-      <w:r>
-        <w:br/>
-      </w:r>
-      <w:r>
-        <w:rPr>
-          <w:sz w:val="16"/>
-          <w:szCs w:val="16"/>
-          <w:b/>
-        </w:rPr>
-        <w:t xml:space="preserve">License Text: </w:t>
-      </w:r>
-      <w:r>
-        <w:br/>
-      </w:r>
-      <w:r>
-        <w:rPr>
-          <w:sz w:val="16"/>
-          <w:szCs w:val="16"/>
-          <w:b/>
-        </w:rPr>
-        <w:t xml:space="preserve">License URL: </w:t>
-      </w:r>
-      <w:r>
-        <w:rPr>
-          <w:sz w:val="16"/>
-          <w:szCs w:val="16"/>
-        </w:rPr>
-        <w:t xml:space="preserve"/>
-      </w:r>
-    </w:p>
-    <w:tbl>
-      <w:tblPr>
-        <w:tblStyle w:val="Table"/>
-        <w:tblW w:type="pct" w:w="5000"/>
-        <w:tblLayout w:type="fixed"/>
-        <w:tblLook w:firstRow="0" w:lastRow="0" w:firstColumn="0" w:lastColumn="0" w:noHBand="0" w:noVBand="0" w:val="0000"/>
-      </w:tblPr>
-      <w:tblGrid>
-        <w:gridCol w:w="7920"/>
-      </w:tblGrid>
-      <w:tr>
-        <w:tc>
-          <w:tcPr/>
-          <w:p>
-            <w:pPr>
-              <w:jc w:val="center"/>
-            </w:pPr>
-            <w:pPr>
-              <w:jc w:val="left"/>
-            </w:pPr>
-            <w:r>
-              <w:drawing>
-                <wp:inline>
-                  <wp:extent cx="5334000" cy="4648479"/>
-                  <wp:effectExtent b="0" l="0" r="0" t="0"/>
-                  <wp:docPr descr="" title="" id="55" name="Picture"/>
-                  <a:graphic>
-                    <a:graphicData uri="http://schemas.openxmlformats.org/drawingml/2006/picture">
-                      <pic:pic>
-                        <pic:nvPicPr>
-                          <pic:cNvPr descr="assets/u2/image1.jpg" id="56" name="Picture"/>
-                          <pic:cNvPicPr>
-                            <a:picLocks noChangeArrowheads="1" noChangeAspect="1"/>
-                          </pic:cNvPicPr>
-                        </pic:nvPicPr>
-                        <pic:blipFill>
-                          <a:blip r:embed="rId54"/>
-                          <a:stretch>
-                            <a:fillRect/>
-                          </a:stretch>
-                        </pic:blipFill>
-                        <pic:spPr bwMode="auto">
-                          <a:xfrm>
-                            <a:off x="0" y="0"/>
-                            <a:ext cx="5334000" cy="4648479"/>
-                          </a:xfrm>
-                          <a:prstGeom prst="rect">
-                            <a:avLst/>
-                          </a:prstGeom>
-                          <a:noFill/>
-                          <a:ln w="9525">
-                            <a:noFill/>
-                            <a:headEnd/>
-                            <a:tailEnd/>
-                          </a:ln>
-                        </pic:spPr>
-                      </pic:pic>
-                    </a:graphicData>
-                  </a:graphic>
-                </wp:inline>
-              </w:drawing>
-            </w:r>
-          </w:p>
-        </w:tc>
-      </w:tr>
-    </w:tbl>
-    <w:p>
-      <w:pPr>
-        <w:pStyle w:val="BodyText"/>
-      </w:pPr>
-      <w:r>
-        <w:rPr>
-          <w:color w:val="f4a6d2"/>
-          <w:sz w:val="24"/>
-          <w:szCs w:val="24"/>
-          <w:b/>
-        </w:rPr>
-        <w:t xml:space="preserve">&lt;End fig-image&gt;</w:t>
-      </w:r>
-    </w:p>
-    <w:p>
-      <w:pPr>
-        <w:pStyle w:val="BodyText"/>
-      </w:pPr>
-      <w:r>
-        <w:rPr>
-          <w:color w:val="7f1caa"/>
-          <w:sz w:val="24"/>
-          <w:szCs w:val="24"/>
-          <w:b/>
-        </w:rPr>
-        <w:t xml:space="preserve">&lt;End figure&gt;</w:t>
-      </w:r>
+        <w:t xml:space="preserve">&lt;End dec-image&gt;</w:t>
+      </w:r>
+    </w:p>
+    <w:p>
+      <w:pPr>
+        <w:pStyle w:val="BodyText"/>
+      </w:pPr>
     </w:p>
     <w:p>
       <w:pPr>
@@ -7646,13 +7331,7 @@
         <w:t xml:space="preserve"> </w:t>
       </w:r>
       <w:r>
-        <w:t xml:space="preserve">“</w:t>
-      </w:r>
-      <w:r>
-        <w:t xml:space="preserve">control</w:t>
-      </w:r>
-      <w:r>
-        <w:t xml:space="preserve">”</w:t>
+        <w:t xml:space="preserve">“control”</w:t>
       </w:r>
       <w:r>
         <w:t xml:space="preserve"> </w:t>
@@ -8109,13 +7788,7 @@
         <w:pStyle w:val="BlockText"/>
       </w:pPr>
       <w:r>
-        <w:t xml:space="preserve">“</w:t>
-      </w:r>
-      <w:r>
-        <w:t xml:space="preserve">No wonder/It makes sense why you continue to use because … because … because …</w:t>
-      </w:r>
-      <w:r>
-        <w:t xml:space="preserve">”</w:t>
+        <w:t xml:space="preserve">“No wonder/It makes sense why you continue to use because … because … because …”</w:t>
       </w:r>
     </w:p>
     <w:p>
@@ -8135,13 +7808,7 @@
         <w:pStyle w:val="BlockText"/>
       </w:pPr>
       <w:r>
-        <w:t xml:space="preserve">“</w:t>
-      </w:r>
-      <w:r>
-        <w:t xml:space="preserve">It makes sense to me why you would be struggling with seeing your own inner strength and value because … because … because …</w:t>
-      </w:r>
-      <w:r>
-        <w:t xml:space="preserve">”</w:t>
+        <w:t xml:space="preserve">“It makes sense to me why you would be struggling with seeing your own inner strength and value because … because … because …”</w:t>
       </w:r>
     </w:p>
     <w:p>
@@ -8161,13 +7828,7 @@
         <w:pStyle w:val="BlockText"/>
       </w:pPr>
       <w:r>
-        <w:t xml:space="preserve">“</w:t>
-      </w:r>
-      <w:r>
-        <w:t xml:space="preserve">I want you to know that …</w:t>
-      </w:r>
-      <w:r>
-        <w:t xml:space="preserve">”</w:t>
+        <w:t xml:space="preserve">“I want you to know that …”</w:t>
       </w:r>
     </w:p>
     <w:p>
@@ -8175,13 +7836,7 @@
         <w:pStyle w:val="BlockText"/>
       </w:pPr>
       <w:r>
-        <w:t xml:space="preserve">“</w:t>
-      </w:r>
-      <w:r>
-        <w:t xml:space="preserve">Why don’t we start by …</w:t>
-      </w:r>
-      <w:r>
-        <w:t xml:space="preserve">”</w:t>
+        <w:t xml:space="preserve">“Why don’t we start by …”</w:t>
       </w:r>
     </w:p>
     <w:p>
@@ -8391,13 +8046,7 @@
         <w:t xml:space="preserve"> </w:t>
       </w:r>
       <w:r>
-        <w:t xml:space="preserve">“</w:t>
-      </w:r>
-      <w:r>
-        <w:t xml:space="preserve">Not why the addiction, but why the pain?</w:t>
-      </w:r>
-      <w:r>
-        <w:t xml:space="preserve">”</w:t>
+        <w:t xml:space="preserve">“Not why the addiction, but why the pain?”</w:t>
       </w:r>
     </w:p>
     <w:p>
@@ -8498,13 +8147,7 @@
         <w:t xml:space="preserve"> </w:t>
       </w:r>
       <w:r>
-        <w:t xml:space="preserve">“</w:t>
-      </w:r>
-      <w:r>
-        <w:t xml:space="preserve">When we add this silence to the fact that most of us have never been taught about the process and normalcy of grief and death, no wonder we struggle</w:t>
-      </w:r>
-      <w:r>
-        <w:t xml:space="preserve">”</w:t>
+        <w:t xml:space="preserve">“When we add this silence to the fact that most of us have never been taught about the process and normalcy of grief and death, no wonder we struggle”</w:t>
       </w:r>
       <w:r>
         <w:t xml:space="preserve"> </w:t>
@@ -9937,10 +9580,7 @@
         <w:t xml:space="preserve"> </w:t>
       </w:r>
       <w:r>
-        <w:t xml:space="preserve">“</w:t>
-      </w:r>
-      <w:r>
-        <w:t xml:space="preserve">Yeah it makes sense that you are suffering,</w:t>
+        <w:t xml:space="preserve">“Yeah it makes sense that you are suffering,</w:t>
       </w:r>
       <w:r>
         <w:t xml:space="preserve"> </w:t>
@@ -9988,10 +9628,7 @@
         <w:t xml:space="preserve"> </w:t>
       </w:r>
       <w:r>
-        <w:t xml:space="preserve">…</w:t>
-      </w:r>
-      <w:r>
-        <w:t xml:space="preserve">”</w:t>
+        <w:t xml:space="preserve">…”</w:t>
       </w:r>
     </w:p>
     <w:p>
@@ -10575,13 +10212,7 @@
         <w:t xml:space="preserve"> </w:t>
       </w:r>
       <w:r>
-        <w:t xml:space="preserve">“</w:t>
-      </w:r>
-      <w:r>
-        <w:t xml:space="preserve">retirement</w:t>
-      </w:r>
-      <w:r>
-        <w:t xml:space="preserve">”</w:t>
+        <w:t xml:space="preserve">“retirement”</w:t>
       </w:r>
       <w:r>
         <w:t xml:space="preserve"> </w:t>
@@ -10605,13 +10236,7 @@
         <w:t xml:space="preserve"> </w:t>
       </w:r>
       <w:r>
-        <w:t xml:space="preserve">“</w:t>
-      </w:r>
-      <w:r>
-        <w:t xml:space="preserve">Modernization did not demote the elderly. It demoted the _________</w:t>
-      </w:r>
-      <w:r>
-        <w:t xml:space="preserve">”</w:t>
+        <w:t xml:space="preserve">“Modernization did not demote the elderly. It demoted the _________”</w:t>
       </w:r>
       <w:r>
         <w:t xml:space="preserve"> </w:t>
@@ -11443,13 +11068,7 @@
         <w:t xml:space="preserve"> </w:t>
       </w:r>
       <w:r>
-        <w:t xml:space="preserve">“</w:t>
-      </w:r>
-      <w:r>
-        <w:t xml:space="preserve">speaking into the void</w:t>
-      </w:r>
-      <w:r>
-        <w:t xml:space="preserve">”</w:t>
+        <w:t xml:space="preserve">“speaking into the void”</w:t>
       </w:r>
       <w:r>
         <w:t xml:space="preserve">?</w:t>
@@ -11850,13 +11469,7 @@
         <w:t xml:space="preserve"> </w:t>
       </w:r>
       <w:r>
-        <w:t xml:space="preserve">“</w:t>
-      </w:r>
-      <w:r>
-        <w:t xml:space="preserve">’speaking into the void.</w:t>
-      </w:r>
-      <w:r>
-        <w:t xml:space="preserve">”</w:t>
+        <w:t xml:space="preserve">“’speaking into the void.”</w:t>
       </w:r>
       <w:r>
         <w:t xml:space="preserve"> </w:t>
@@ -11868,13 +11481,7 @@
         <w:t xml:space="preserve"> </w:t>
       </w:r>
       <w:r>
-        <w:t xml:space="preserve">“</w:t>
-      </w:r>
-      <w:r>
-        <w:t xml:space="preserve">blocked</w:t>
-      </w:r>
-      <w:r>
-        <w:t xml:space="preserve">”</w:t>
+        <w:t xml:space="preserve">“blocked”</w:t>
       </w:r>
       <w:r>
         <w:t xml:space="preserve"> </w:t>
@@ -12113,13 +11720,7 @@
         <w:t xml:space="preserve"> </w:t>
       </w:r>
       <w:r>
-        <w:t xml:space="preserve">“</w:t>
-      </w:r>
-      <w:r>
-        <w:t xml:space="preserve">the furnace?</w:t>
-      </w:r>
-      <w:r>
-        <w:t xml:space="preserve">”</w:t>
+        <w:t xml:space="preserve">“the furnace?”</w:t>
       </w:r>
       <w:r>
         <w:t xml:space="preserve"> </w:t>
@@ -12139,13 +11740,7 @@
         <w:t xml:space="preserve"> </w:t>
       </w:r>
       <w:r>
-        <w:t xml:space="preserve">“</w:t>
-      </w:r>
-      <w:r>
-        <w:t xml:space="preserve">takeaways</w:t>
-      </w:r>
-      <w:r>
-        <w:t xml:space="preserve">”</w:t>
+        <w:t xml:space="preserve">“takeaways”</w:t>
       </w:r>
       <w:r>
         <w:t xml:space="preserve"> </w:t>
@@ -12201,13 +11796,7 @@
         <w:t xml:space="preserve"> </w:t>
       </w:r>
       <w:r>
-        <w:t xml:space="preserve">“</w:t>
-      </w:r>
-      <w:r>
-        <w:t xml:space="preserve">Weeping,</w:t>
-      </w:r>
-      <w:r>
-        <w:t xml:space="preserve">”</w:t>
+        <w:t xml:space="preserve">“Weeping,”</w:t>
       </w:r>
       <w:r>
         <w:t xml:space="preserve"> </w:t>
@@ -12360,13 +11949,7 @@
         <w:t xml:space="preserve"> </w:t>
       </w:r>
       <w:r>
-        <w:t xml:space="preserve">“</w:t>
-      </w:r>
-      <w:r>
-        <w:t xml:space="preserve">conversation starters</w:t>
-      </w:r>
-      <w:r>
-        <w:t xml:space="preserve">”</w:t>
+        <w:t xml:space="preserve">“conversation starters”</w:t>
       </w:r>
       <w:r>
         <w:t xml:space="preserve"> </w:t>
@@ -13102,13 +12685,7 @@
         <w:t xml:space="preserve"> </w:t>
       </w:r>
       <w:r>
-        <w:t xml:space="preserve">“</w:t>
-      </w:r>
-      <w:r>
-        <w:t xml:space="preserve">main</w:t>
-      </w:r>
-      <w:r>
-        <w:t xml:space="preserve">”</w:t>
+        <w:t xml:space="preserve">“main”</w:t>
       </w:r>
       <w:r>
         <w:t xml:space="preserve"> </w:t>
@@ -13872,13 +13449,7 @@
         <w:t xml:space="preserve"> </w:t>
       </w:r>
       <w:r>
-        <w:t xml:space="preserve">“</w:t>
-      </w:r>
-      <w:r>
-        <w:t xml:space="preserve">father of suicide</w:t>
-      </w:r>
-      <w:r>
-        <w:t xml:space="preserve">”</w:t>
+        <w:t xml:space="preserve">“father of suicide”</w:t>
       </w:r>
       <w:r>
         <w:t xml:space="preserve"> </w:t>
@@ -13890,13 +13461,7 @@
         <w:t xml:space="preserve"> </w:t>
       </w:r>
       <w:r>
-        <w:t xml:space="preserve">“</w:t>
-      </w:r>
-      <w:r>
-        <w:t xml:space="preserve">psychache</w:t>
-      </w:r>
-      <w:r>
-        <w:t xml:space="preserve">”</w:t>
+        <w:t xml:space="preserve">“psychache”</w:t>
       </w:r>
       <w:r>
         <w:t xml:space="preserve"> </w:t>
@@ -13908,13 +13473,7 @@
         <w:t xml:space="preserve"> </w:t>
       </w:r>
       <w:r>
-        <w:t xml:space="preserve">“</w:t>
-      </w:r>
-      <w:r>
-        <w:t xml:space="preserve">psychache,</w:t>
-      </w:r>
-      <w:r>
-        <w:t xml:space="preserve">”</w:t>
+        <w:t xml:space="preserve">“psychache,”</w:t>
       </w:r>
       <w:r>
         <w:t xml:space="preserve"> </w:t>
@@ -14260,23 +13819,7 @@
             <w:i/>
             <w:iCs/>
           </w:rPr>
-          <w:t xml:space="preserve">‘</w:t>
-        </w:r>
-        <w:r>
-          <w:rPr>
-            <w:rStyle w:val="Hyperlink"/>
-            <w:i/>
-            <w:iCs/>
-          </w:rPr>
-          <w:t xml:space="preserve">Suicide Cluster</w:t>
-        </w:r>
-        <w:r>
-          <w:rPr>
-            <w:rStyle w:val="Hyperlink"/>
-            <w:i/>
-            <w:iCs/>
-          </w:rPr>
-          <w:t xml:space="preserve">’</w:t>
+          <w:t xml:space="preserve">‘Suicide Cluster’</w:t>
         </w:r>
         <w:r>
           <w:rPr>
@@ -14410,13 +13953,7 @@
         <w:t xml:space="preserve"> </w:t>
       </w:r>
       <w:r>
-        <w:t xml:space="preserve">“</w:t>
-      </w:r>
-      <w:r>
-        <w:t xml:space="preserve">contagion</w:t>
-      </w:r>
-      <w:r>
-        <w:t xml:space="preserve">”</w:t>
+        <w:t xml:space="preserve">“contagion”</w:t>
       </w:r>
       <w:r>
         <w:t xml:space="preserve"> </w:t>
@@ -14877,13 +14414,7 @@
         <w:t xml:space="preserve"> </w:t>
       </w:r>
       <w:r>
-        <w:t xml:space="preserve">“</w:t>
-      </w:r>
-      <w:r>
-        <w:t xml:space="preserve">outcome driven</w:t>
-      </w:r>
-      <w:r>
-        <w:t xml:space="preserve">”</w:t>
+        <w:t xml:space="preserve">“outcome driven”</w:t>
       </w:r>
       <w:r>
         <w:t xml:space="preserve"> </w:t>
@@ -16200,13 +15731,7 @@
         <w:t xml:space="preserve"> </w:t>
       </w:r>
       <w:r>
-        <w:t xml:space="preserve">“</w:t>
-      </w:r>
-      <w:r>
-        <w:t xml:space="preserve">call to action?</w:t>
-      </w:r>
-      <w:r>
-        <w:t xml:space="preserve">”</w:t>
+        <w:t xml:space="preserve">“call to action?”</w:t>
       </w:r>
       <w:r>
         <w:t xml:space="preserve"> </w:t>
@@ -16921,13 +16446,7 @@
         <w:t xml:space="preserve"> </w:t>
       </w:r>
       <w:r>
-        <w:t xml:space="preserve">“</w:t>
-      </w:r>
-      <w:r>
-        <w:t xml:space="preserve">I want to end my life,</w:t>
-      </w:r>
-      <w:r>
-        <w:t xml:space="preserve">”</w:t>
+        <w:t xml:space="preserve">“I want to end my life,”</w:t>
       </w:r>
       <w:r>
         <w:t xml:space="preserve"> </w:t>
@@ -17429,13 +16948,7 @@
         <w:t xml:space="preserve"> </w:t>
       </w:r>
       <w:r>
-        <w:t xml:space="preserve">“</w:t>
-      </w:r>
-      <w:r>
-        <w:t xml:space="preserve">Fathers</w:t>
-      </w:r>
-      <w:r>
-        <w:t xml:space="preserve">”</w:t>
+        <w:t xml:space="preserve">“Fathers”</w:t>
       </w:r>
       <w:r>
         <w:t xml:space="preserve"> </w:t>
@@ -17709,13 +17222,7 @@
         <w:t xml:space="preserve"> </w:t>
       </w:r>
       <w:r>
-        <w:t xml:space="preserve">“</w:t>
-      </w:r>
-      <w:r>
-        <w:t xml:space="preserve">Fathers</w:t>
-      </w:r>
-      <w:r>
-        <w:t xml:space="preserve">”</w:t>
+        <w:t xml:space="preserve">“Fathers”</w:t>
       </w:r>
       <w:r>
         <w:t xml:space="preserve"> </w:t>
@@ -17777,13 +17284,7 @@
         <w:t xml:space="preserve"> </w:t>
       </w:r>
       <w:r>
-        <w:t xml:space="preserve">“</w:t>
-      </w:r>
-      <w:r>
-        <w:t xml:space="preserve">father of the field.</w:t>
-      </w:r>
-      <w:r>
-        <w:t xml:space="preserve">”</w:t>
+        <w:t xml:space="preserve">“father of the field.”</w:t>
       </w:r>
       <w:r>
         <w:t xml:space="preserve"> </w:t>
@@ -17795,13 +17296,7 @@
         <w:t xml:space="preserve"> </w:t>
       </w:r>
       <w:r>
-        <w:t xml:space="preserve">“</w:t>
-      </w:r>
-      <w:r>
-        <w:t xml:space="preserve">stress</w:t>
-      </w:r>
-      <w:r>
-        <w:t xml:space="preserve">”</w:t>
+        <w:t xml:space="preserve">“stress”</w:t>
       </w:r>
       <w:r>
         <w:t xml:space="preserve"> </w:t>
@@ -17813,13 +17308,7 @@
         <w:t xml:space="preserve"> </w:t>
       </w:r>
       <w:r>
-        <w:t xml:space="preserve">“</w:t>
-      </w:r>
-      <w:r>
-        <w:t xml:space="preserve">general adaptation syndrome,</w:t>
-      </w:r>
-      <w:r>
-        <w:t xml:space="preserve">”</w:t>
+        <w:t xml:space="preserve">“general adaptation syndrome,”</w:t>
       </w:r>
       <w:r>
         <w:t xml:space="preserve"> </w:t>
@@ -17981,13 +17470,7 @@
         <w:t xml:space="preserve"> </w:t>
       </w:r>
       <w:r>
-        <w:t xml:space="preserve">“</w:t>
-      </w:r>
-      <w:r>
-        <w:t xml:space="preserve">father</w:t>
-      </w:r>
-      <w:r>
-        <w:t xml:space="preserve">”</w:t>
+        <w:t xml:space="preserve">“father”</w:t>
       </w:r>
       <w:r>
         <w:t xml:space="preserve"> </w:t>
@@ -19511,13 +18994,7 @@
         <w:t xml:space="preserve"> </w:t>
       </w:r>
       <w:r>
-        <w:t xml:space="preserve">“</w:t>
-      </w:r>
-      <w:r>
-        <w:t xml:space="preserve">We already have inside of us the ingredients to allow healing to occur, we just need …</w:t>
-      </w:r>
-      <w:r>
-        <w:t xml:space="preserve">”</w:t>
+        <w:t xml:space="preserve">“We already have inside of us the ingredients to allow healing to occur, we just need …”</w:t>
       </w:r>
       <w:r>
         <w:t xml:space="preserve"> </w:t>
@@ -19775,13 +19252,7 @@
         <w:t xml:space="preserve"> </w:t>
       </w:r>
       <w:r>
-        <w:t xml:space="preserve">“</w:t>
-      </w:r>
-      <w:r>
-        <w:t xml:space="preserve">we.</w:t>
-      </w:r>
-      <w:r>
-        <w:t xml:space="preserve">”</w:t>
+        <w:t xml:space="preserve">“we.”</w:t>
       </w:r>
     </w:p>
     <w:p>
@@ -19974,13 +19445,7 @@
         <w:t xml:space="preserve"> </w:t>
       </w:r>
       <w:r>
-        <w:t xml:space="preserve">“</w:t>
-      </w:r>
-      <w:r>
-        <w:t xml:space="preserve">behaviour intervention</w:t>
-      </w:r>
-      <w:r>
-        <w:t xml:space="preserve">”</w:t>
+        <w:t xml:space="preserve">“behaviour intervention”</w:t>
       </w:r>
       <w:r>
         <w:t xml:space="preserve"> </w:t>
@@ -19992,13 +19457,7 @@
         <w:t xml:space="preserve"> </w:t>
       </w:r>
       <w:r>
-        <w:t xml:space="preserve">“</w:t>
-      </w:r>
-      <w:r>
-        <w:t xml:space="preserve">get it.</w:t>
-      </w:r>
-      <w:r>
-        <w:t xml:space="preserve">”</w:t>
+        <w:t xml:space="preserve">“get it.”</w:t>
       </w:r>
     </w:p>
     <w:p>
@@ -20737,13 +20196,7 @@
         <w:t xml:space="preserve"> </w:t>
       </w:r>
       <w:r>
-        <w:t xml:space="preserve">“</w:t>
-      </w:r>
-      <w:r>
-        <w:t xml:space="preserve">How can Christians understand and apply psychology as a discipline?</w:t>
-      </w:r>
-      <w:r>
-        <w:t xml:space="preserve">”</w:t>
+        <w:t xml:space="preserve">“How can Christians understand and apply psychology as a discipline?”</w:t>
       </w:r>
       <w:r>
         <w:t xml:space="preserve"> </w:t>
@@ -20993,13 +20446,7 @@
         <w:t xml:space="preserve"> </w:t>
       </w:r>
       <w:r>
-        <w:t xml:space="preserve">“</w:t>
-      </w:r>
-      <w:r>
-        <w:t xml:space="preserve">how</w:t>
-      </w:r>
-      <w:r>
-        <w:t xml:space="preserve">”</w:t>
+        <w:t xml:space="preserve">“how”</w:t>
       </w:r>
       <w:r>
         <w:t xml:space="preserve"> </w:t>
@@ -21429,13 +20876,7 @@
         <w:t xml:space="preserve"> </w:t>
       </w:r>
       <w:r>
-        <w:t xml:space="preserve">“</w:t>
-      </w:r>
-      <w:r>
-        <w:t xml:space="preserve">all truth is God’s truth,</w:t>
-      </w:r>
-      <w:r>
-        <w:t xml:space="preserve">”</w:t>
+        <w:t xml:space="preserve">“all truth is God’s truth,”</w:t>
       </w:r>
       <w:r>
         <w:t xml:space="preserve"> </w:t>
@@ -21447,13 +20888,7 @@
         <w:t xml:space="preserve"> </w:t>
       </w:r>
       <w:r>
-        <w:t xml:space="preserve">“</w:t>
-      </w:r>
-      <w:r>
-        <w:t xml:space="preserve">secularized</w:t>
-      </w:r>
-      <w:r>
-        <w:t xml:space="preserve">”</w:t>
+        <w:t xml:space="preserve">“secularized”</w:t>
       </w:r>
       <w:r>
         <w:t xml:space="preserve"> </w:t>
@@ -21535,13 +20970,7 @@
         <w:pStyle w:val="BlockText"/>
       </w:pPr>
       <w:r>
-        <w:t xml:space="preserve">“</w:t>
-      </w:r>
-      <w:r>
-        <w:t xml:space="preserve">Integration is a recursive process of expanding understanding, but always with our most fundamental loyalty being to the true teachings of the special revelation of the Bible. Integration is ultimately the task of the Christian person whom God has led to be a student or scholar of some facet of psychology, with the true teachings of special revelation as the guiding framework for how that person structures his or her deepest beliefs and loyalties</w:t>
-      </w:r>
-      <w:r>
-        <w:t xml:space="preserve">”</w:t>
+        <w:t xml:space="preserve">“Integration is a recursive process of expanding understanding, but always with our most fundamental loyalty being to the true teachings of the special revelation of the Bible. Integration is ultimately the task of the Christian person whom God has led to be a student or scholar of some facet of psychology, with the true teachings of special revelation as the guiding framework for how that person structures his or her deepest beliefs and loyalties”</w:t>
       </w:r>
       <w:r>
         <w:t xml:space="preserve"> </w:t>
@@ -21869,13 +21298,7 @@
         <w:pStyle w:val="BlockText"/>
       </w:pPr>
       <w:r>
-        <w:t xml:space="preserve">“</w:t>
-      </w:r>
-      <w:r>
-        <w:t xml:space="preserve">However our primary agenda in this chapter was to show the need for Christians to practice their psychology in light of their basic assumptions and the resources of their distinctive tradition. At the most comprehensive level,</w:t>
-      </w:r>
-      <w:r>
-        <w:t xml:space="preserve">”</w:t>
+        <w:t xml:space="preserve">“However our primary agenda in this chapter was to show the need for Christians to practice their psychology in light of their basic assumptions and the resources of their distinctive tradition. At the most comprehensive level,”</w:t>
       </w:r>
       <w:r>
         <w:t xml:space="preserve">tradition validity” for Christians will mean that the Christian worldview, which comes to us from the past, will enable us to meet the challenges of the present faithfully by rationally and empirically demonstrating how essential the love of Christ is for our future” (pp. 173, 174).</w:t>
@@ -22238,13 +21661,7 @@
         <w:t xml:space="preserve"> </w:t>
       </w:r>
       <w:r>
-        <w:t xml:space="preserve">“</w:t>
-      </w:r>
-      <w:r>
-        <w:t xml:space="preserve">The bottom line will be that doing science and, in this case, psychology is ultimately an act of love</w:t>
-      </w:r>
-      <w:r>
-        <w:t xml:space="preserve">”</w:t>
+        <w:t xml:space="preserve">“The bottom line will be that doing science and, in this case, psychology is ultimately an act of love”</w:t>
       </w:r>
       <w:r>
         <w:t xml:space="preserve"> </w:t>
@@ -22514,13 +21931,7 @@
         <w:t xml:space="preserve"> </w:t>
       </w:r>
       <w:r>
-        <w:t xml:space="preserve">“</w:t>
-      </w:r>
-      <w:r>
-        <w:t xml:space="preserve">Christian Ministry is a psychotherapy</w:t>
-      </w:r>
-      <w:r>
-        <w:t xml:space="preserve">”</w:t>
+        <w:t xml:space="preserve">“Christian Ministry is a psychotherapy”</w:t>
       </w:r>
       <w:r>
         <w:t xml:space="preserve"> </w:t>
@@ -22655,13 +22066,7 @@
         <w:t xml:space="preserve"> </w:t>
       </w:r>
       <w:r>
-        <w:t xml:space="preserve">“</w:t>
-      </w:r>
-      <w:r>
-        <w:t xml:space="preserve">big names</w:t>
-      </w:r>
-      <w:r>
-        <w:t xml:space="preserve">”</w:t>
+        <w:t xml:space="preserve">“big names”</w:t>
       </w:r>
       <w:r>
         <w:t xml:space="preserve"> </w:t>
@@ -22673,13 +22078,7 @@
         <w:t xml:space="preserve"> </w:t>
       </w:r>
       <w:r>
-        <w:t xml:space="preserve">“</w:t>
-      </w:r>
-      <w:r>
-        <w:t xml:space="preserve">regular</w:t>
-      </w:r>
-      <w:r>
-        <w:t xml:space="preserve">”</w:t>
+        <w:t xml:space="preserve">“regular”</w:t>
       </w:r>
       <w:r>
         <w:t xml:space="preserve"> </w:t>
@@ -22751,13 +22150,7 @@
         <w:t xml:space="preserve"> </w:t>
       </w:r>
       <w:r>
-        <w:t xml:space="preserve">“</w:t>
-      </w:r>
-      <w:r>
-        <w:t xml:space="preserve">regular</w:t>
-      </w:r>
-      <w:r>
-        <w:t xml:space="preserve">”</w:t>
+        <w:t xml:space="preserve">“regular”</w:t>
       </w:r>
       <w:r>
         <w:t xml:space="preserve"> </w:t>
@@ -23290,13 +22683,7 @@
         <w:t xml:space="preserve"> </w:t>
       </w:r>
       <w:r>
-        <w:t xml:space="preserve">“</w:t>
-      </w:r>
-      <w:r>
-        <w:t xml:space="preserve">triaged</w:t>
-      </w:r>
-      <w:r>
-        <w:t xml:space="preserve">”</w:t>
+        <w:t xml:space="preserve">“triaged”</w:t>
       </w:r>
       <w:r>
         <w:t xml:space="preserve">?</w:t>
@@ -24435,13 +23822,7 @@
         <w:t xml:space="preserve"> </w:t>
       </w:r>
       <w:r>
-        <w:t xml:space="preserve">‘</w:t>
-      </w:r>
-      <w:r>
-        <w:t xml:space="preserve">personal issues.</w:t>
-      </w:r>
-      <w:r>
-        <w:t xml:space="preserve">’</w:t>
+        <w:t xml:space="preserve">‘personal issues.’</w:t>
       </w:r>
       <w:r>
         <w:t xml:space="preserve"> </w:t>
@@ -24627,13 +24008,7 @@
         <w:t xml:space="preserve"> </w:t>
       </w:r>
       <w:r>
-        <w:t xml:space="preserve">‘</w:t>
-      </w:r>
-      <w:r>
-        <w:t xml:space="preserve">your assigned topic</w:t>
-      </w:r>
-      <w:r>
-        <w:t xml:space="preserve">’</w:t>
+        <w:t xml:space="preserve">‘your assigned topic’</w:t>
       </w:r>
       <w:r>
         <w:t xml:space="preserve">? I invite you to use one of your case conceptualization scenarios as an illustration/case study to incorporate into this paper. The paper will cover</w:t>
@@ -24896,13 +24271,7 @@
         <w:t xml:space="preserve"> </w:t>
       </w:r>
       <w:r>
-        <w:t xml:space="preserve">‘</w:t>
-      </w:r>
-      <w:r>
-        <w:t xml:space="preserve">voice</w:t>
-      </w:r>
-      <w:r>
-        <w:t xml:space="preserve">’</w:t>
+        <w:t xml:space="preserve">‘voice’</w:t>
       </w:r>
       <w:r>
         <w:t xml:space="preserve"> </w:t>
@@ -24969,13 +24338,7 @@
         <w:t xml:space="preserve"> </w:t>
       </w:r>
       <w:r>
-        <w:t xml:space="preserve">‘</w:t>
-      </w:r>
-      <w:r>
-        <w:t xml:space="preserve">padding your references</w:t>
-      </w:r>
-      <w:r>
-        <w:t xml:space="preserve">’</w:t>
+        <w:t xml:space="preserve">‘padding your references’</w:t>
       </w:r>
       <w:r>
         <w:t xml:space="preserve"> </w:t>
@@ -25730,7 +25093,6 @@
           <w:p>
             <w:pPr>
               <w:pStyle w:val="Compact"/>
-              <w:jc w:val="left"/>
             </w:pPr>
             <w:r>
               <w:rPr>
@@ -25746,7 +25108,6 @@
           <w:p>
             <w:pPr>
               <w:pStyle w:val="Compact"/>
-              <w:jc w:val="left"/>
             </w:pPr>
             <w:r>
               <w:rPr>
@@ -25762,7 +25123,6 @@
           <w:p>
             <w:pPr>
               <w:pStyle w:val="Compact"/>
-              <w:jc w:val="left"/>
             </w:pPr>
             <w:r>
               <w:rPr>
@@ -25778,7 +25138,6 @@
           <w:p>
             <w:pPr>
               <w:pStyle w:val="Compact"/>
-              <w:jc w:val="left"/>
             </w:pPr>
             <w:r>
               <w:rPr>
@@ -25796,7 +25155,6 @@
           <w:p>
             <w:pPr>
               <w:pStyle w:val="Compact"/>
-              <w:jc w:val="left"/>
             </w:pPr>
             <w:r>
               <w:rPr>
@@ -25812,7 +25170,6 @@
           <w:p>
             <w:pPr>
               <w:pStyle w:val="Compact"/>
-              <w:jc w:val="left"/>
             </w:pPr>
             <w:r>
               <w:t xml:space="preserve">Sound evidence that student has done course readings and has a thorough knowledge of discussion topic</w:t>
@@ -25824,7 +25181,6 @@
           <w:p>
             <w:pPr>
               <w:pStyle w:val="Compact"/>
-              <w:jc w:val="left"/>
             </w:pPr>
             <w:r>
               <w:t xml:space="preserve">Evidence that most of course readings done and student has some knowledge of discussion topic</w:t>
@@ -25836,7 +25192,6 @@
           <w:p>
             <w:pPr>
               <w:pStyle w:val="Compact"/>
-              <w:jc w:val="left"/>
             </w:pPr>
             <w:r>
               <w:t xml:space="preserve">Minor evidence that course readings were done and student understands discussion topic</w:t>
@@ -25850,7 +25205,6 @@
           <w:p>
             <w:pPr>
               <w:pStyle w:val="Compact"/>
-              <w:jc w:val="left"/>
             </w:pPr>
             <w:r>
               <w:rPr>
@@ -25866,7 +25220,6 @@
           <w:p>
             <w:pPr>
               <w:pStyle w:val="Compact"/>
-              <w:jc w:val="left"/>
             </w:pPr>
             <w:r>
               <w:t xml:space="preserve">Postings are clear, concise and easy to understand</w:t>
@@ -25878,7 +25231,6 @@
           <w:p>
             <w:pPr>
               <w:pStyle w:val="Compact"/>
-              <w:jc w:val="left"/>
             </w:pPr>
             <w:r>
               <w:t xml:space="preserve">Postings are usually, but not always clear, concise and easy to understand</w:t>
@@ -25890,7 +25242,6 @@
           <w:p>
             <w:pPr>
               <w:pStyle w:val="Compact"/>
-              <w:jc w:val="left"/>
             </w:pPr>
             <w:r>
               <w:t xml:space="preserve">Postings are too short/long and/or unclear and hard to understand</w:t>
@@ -25904,7 +25255,6 @@
           <w:p>
             <w:pPr>
               <w:pStyle w:val="Compact"/>
-              <w:jc w:val="left"/>
             </w:pPr>
             <w:r>
               <w:rPr>
@@ -25920,7 +25270,6 @@
           <w:p>
             <w:pPr>
               <w:pStyle w:val="Compact"/>
-              <w:jc w:val="left"/>
             </w:pPr>
             <w:r>
               <w:t xml:space="preserve">Exceptionally well- supported, thoughtful, insightful comments made on others’ and own postings</w:t>
@@ -25932,7 +25281,6 @@
           <w:p>
             <w:pPr>
               <w:pStyle w:val="Compact"/>
-              <w:jc w:val="left"/>
             </w:pPr>
             <w:r>
               <w:t xml:space="preserve">Some evidence of critical thought and self-reflection on others’ and own postings</w:t>
@@ -25944,7 +25292,6 @@
           <w:p>
             <w:pPr>
               <w:pStyle w:val="Compact"/>
-              <w:jc w:val="left"/>
             </w:pPr>
             <w:r>
               <w:t xml:space="preserve">Minor evidence of critical thought and reflection on others’ and own postings</w:t>
@@ -25958,7 +25305,6 @@
           <w:p>
             <w:pPr>
               <w:pStyle w:val="Compact"/>
-              <w:jc w:val="left"/>
             </w:pPr>
             <w:r>
               <w:rPr>
@@ -25974,7 +25320,6 @@
           <w:p>
             <w:pPr>
               <w:pStyle w:val="Compact"/>
-              <w:jc w:val="left"/>
             </w:pPr>
             <w:r>
               <w:t xml:space="preserve">Regularly participates in, and facilitates interaction among members of online community</w:t>
@@ -25986,7 +25331,6 @@
           <w:p>
             <w:pPr>
               <w:pStyle w:val="Compact"/>
-              <w:jc w:val="left"/>
             </w:pPr>
             <w:r>
               <w:t xml:space="preserve">Interacts now and then with other members of online community</w:t>
@@ -25998,7 +25342,6 @@
           <w:p>
             <w:pPr>
               <w:pStyle w:val="Compact"/>
-              <w:jc w:val="left"/>
             </w:pPr>
             <w:r>
               <w:t xml:space="preserve">Rarely interacts or responds to other members of online community</w:t>
@@ -26036,7 +25379,6 @@
           <w:p>
             <w:pPr>
               <w:pStyle w:val="Compact"/>
-              <w:jc w:val="left"/>
             </w:pPr>
             <w:r>
               <w:rPr>
@@ -26166,13 +25508,7 @@
         <w:pStyle w:val="BlockText"/>
       </w:pPr>
       <w:r>
-        <w:t xml:space="preserve">“</w:t>
-      </w:r>
-      <w:r>
-        <w:t xml:space="preserve">How do you reconcile your commitment to psychological science with your commitment to the Christian faith? 1. How do they fit together? 2. Are they mutually supportive? 3. Are there points of tension?</w:t>
-      </w:r>
-      <w:r>
-        <w:t xml:space="preserve">”</w:t>
+        <w:t xml:space="preserve">“How do you reconcile your commitment to psychological science with your commitment to the Christian faith? 1. How do they fit together? 2. Are they mutually supportive? 3. Are there points of tension?”</w:t>
       </w:r>
       <w:r>
         <w:t xml:space="preserve"> </w:t>
@@ -27959,21 +27295,7 @@
           <w:i/>
           <w:iCs/>
         </w:rPr>
-        <w:t xml:space="preserve">K</w:t>
-      </w:r>
-      <w:r>
-        <w:rPr>
-          <w:i/>
-          <w:iCs/>
-        </w:rPr>
-        <w:t xml:space="preserve">ü</w:t>
-      </w:r>
-      <w:r>
-        <w:rPr>
-          <w:i/>
-          <w:iCs/>
-        </w:rPr>
-        <w:t xml:space="preserve">bler-Ross Foundation</w:t>
+        <w:t xml:space="preserve">Kübler-Ross Foundation</w:t>
       </w:r>
       <w:r>
         <w:t xml:space="preserve">. (n.d.). https://www.ekrfoundation.org/.</w:t>
@@ -28599,14 +27921,7 @@
           <w:i/>
           <w:iCs/>
         </w:rPr>
-        <w:t xml:space="preserve">Gabor Mat</w:t>
-      </w:r>
-      <w:r>
-        <w:rPr>
-          <w:i/>
-          <w:iCs/>
-        </w:rPr>
-        <w:t xml:space="preserve">é</w:t>
+        <w:t xml:space="preserve">Gabor Maté</w:t>
       </w:r>
       <w:r>
         <w:rPr>
@@ -29487,14 +28802,7 @@
           <w:i/>
           <w:iCs/>
         </w:rPr>
-        <w:t xml:space="preserve">Gabor Mat</w:t>
-      </w:r>
-      <w:r>
-        <w:rPr>
-          <w:i/>
-          <w:iCs/>
-        </w:rPr>
-        <w:t xml:space="preserve">é</w:t>
+        <w:t xml:space="preserve">Gabor Maté</w:t>
       </w:r>
       <w:r>
         <w:rPr>
@@ -29672,13 +28980,7 @@
         <w:t xml:space="preserve"> </w:t>
       </w:r>
       <w:r>
-        <w:t xml:space="preserve">K</w:t>
-      </w:r>
-      <w:r>
-        <w:t xml:space="preserve">ü</w:t>
-      </w:r>
-      <w:r>
-        <w:t xml:space="preserve">bler-Ross</w:t>
+        <w:t xml:space="preserve">Kübler-Ross</w:t>
       </w:r>
       <w:r>
         <w:t xml:space="preserve">, and</w:t>
@@ -34242,7 +33544,7 @@
   </w:style>
   <w:style w:styleId="Subtitle" w:type="paragraph">
     <w:name w:val="Subtitle"/>
-    <w:basedOn w:val="Normal"/>
+    <w:basedOn w:val="Title"/>
     <w:next w:val="BodyText"/>
     <w:link w:val="SubtitleChar"/>
     <w:uiPriority w:val="11"/>
@@ -34255,7 +33557,6 @@
     </w:pPr>
     <w:rPr>
       <w:rFonts w:cstheme="majorBidi" w:eastAsiaTheme="majorEastAsia"/>
-      <w:color w:themeColor="text1" w:themeTint="A6" w:val="595959"/>
       <w:spacing w:val="15"/>
       <w:sz w:val="28"/>
       <w:szCs w:val="28"/>
@@ -34308,7 +33609,6 @@
     </w:pPr>
     <w:rPr>
       <w:b/>
-      <w:color w:val="345A8A"/>
       <w:sz w:val="20"/>
       <w:szCs w:val="20"/>
     </w:rPr>

</xml_diff>

<commit_message>
2.3.2 adjusted size #12
</commit_message>
<xml_diff>
--- a/docs/PSYC-339.docx
+++ b/docs/PSYC-339.docx
@@ -7097,6 +7097,18 @@
       </w:pPr>
       <w:r>
         <w:t xml:space="preserve">Two of these areas are highlighted by EFFT: family environment and emotional processing. The diagram below provides a good visual of this; it was created by Adele LaFrance and Natasha Files (2018) for presentation purposes.</w:t>
+      </w:r>
+    </w:p>
+    <w:p>
+      <w:pPr>
+        <w:pStyle w:val="BodyText"/>
+      </w:pPr>
+      <w:r>
+        <w:rPr>
+          <w:b/>
+          <w:bCs/>
+        </w:rPr>
+        <w:t xml:space="preserve">Figure 2.1 Two Areas Highlighted by EFFT in Mental Health</w:t>
       </w:r>
     </w:p>
     <w:p>

</xml_diff>

<commit_message>
ID QA Review for PSYC 339 Fixes #9
</commit_message>
<xml_diff>
--- a/docs/PSYC-339.docx
+++ b/docs/PSYC-339.docx
@@ -23,7 +23,7 @@
         <w:pStyle w:val="Date"/>
       </w:pPr>
       <w:r>
-        <w:t xml:space="preserve">Jan 15, 2026</w:t>
+        <w:t xml:space="preserve">Feb 12, 2026</w:t>
       </w:r>
     </w:p>
     <w:sdt>
@@ -4107,13 +4107,16 @@
           <w:numId w:val="1039"/>
         </w:numPr>
       </w:pPr>
-      <w:r>
-        <w:rPr>
-          <w:i/>
-          <w:iCs/>
-        </w:rPr>
-        <w:t xml:space="preserve">Emotion-Focused Family Therapy: A Transdiagnostic Model for Caregiver-Focused Interventions</w:t>
-      </w:r>
+      <w:hyperlink r:id="rId40">
+        <w:r>
+          <w:rPr>
+            <w:rStyle w:val="Hyperlink"/>
+            <w:i/>
+            <w:iCs/>
+          </w:rPr>
+          <w:t xml:space="preserve">Emotion-Focused Family Therapy: A Transdiagnostic Model for Caregiver-Focused Interventions</w:t>
+        </w:r>
+      </w:hyperlink>
       <w:r>
         <w:t xml:space="preserve"> </w:t>
       </w:r>
@@ -4413,7 +4416,7 @@
           <w:numId w:val="1041"/>
         </w:numPr>
       </w:pPr>
-      <w:hyperlink r:id="rId40">
+      <w:hyperlink r:id="rId41">
         <w:r>
           <w:rPr>
             <w:rStyle w:val="Hyperlink"/>
@@ -4436,7 +4439,7 @@
           <w:numId w:val="1041"/>
         </w:numPr>
       </w:pPr>
-      <w:hyperlink r:id="rId41">
+      <w:hyperlink r:id="rId42">
         <w:r>
           <w:rPr>
             <w:rStyle w:val="Hyperlink"/>
@@ -4461,7 +4464,7 @@
           <w:numId w:val="1041"/>
         </w:numPr>
       </w:pPr>
-      <w:hyperlink r:id="rId42">
+      <w:hyperlink r:id="rId43">
         <w:r>
           <w:rPr>
             <w:rStyle w:val="Hyperlink"/>
@@ -4486,7 +4489,7 @@
           <w:numId w:val="1041"/>
         </w:numPr>
       </w:pPr>
-      <w:hyperlink r:id="rId43">
+      <w:hyperlink r:id="rId44">
         <w:r>
           <w:rPr>
             <w:rStyle w:val="Hyperlink"/>
@@ -4509,7 +4512,7 @@
           <w:numId w:val="1041"/>
         </w:numPr>
       </w:pPr>
-      <w:hyperlink r:id="rId44">
+      <w:hyperlink r:id="rId45">
         <w:r>
           <w:rPr>
             <w:rStyle w:val="Hyperlink"/>
@@ -4604,7 +4607,7 @@
           <w:numId w:val="1042"/>
         </w:numPr>
       </w:pPr>
-      <w:hyperlink r:id="rId45">
+      <w:hyperlink r:id="rId46">
         <w:r>
           <w:rPr>
             <w:rStyle w:val="Hyperlink"/>
@@ -4639,7 +4642,7 @@
       <w:pPr>
         <w:pStyle w:val="BodyText"/>
       </w:pPr>
-      <w:hyperlink r:id="rId46">
+      <w:hyperlink r:id="rId47">
         <w:r>
           <w:rPr>
             <w:rStyle w:val="Hyperlink"/>
@@ -5365,7 +5368,7 @@
       <w:r>
         <w:t xml:space="preserve"> </w:t>
       </w:r>
-      <w:hyperlink r:id="rId47">
+      <w:hyperlink r:id="rId48">
         <w:r>
           <w:rPr>
             <w:rStyle w:val="Hyperlink"/>
@@ -5530,7 +5533,7 @@
       <w:r>
         <w:t xml:space="preserve"> </w:t>
       </w:r>
-      <w:hyperlink r:id="rId47">
+      <w:hyperlink r:id="rId48">
         <w:r>
           <w:rPr>
             <w:rStyle w:val="Hyperlink"/>
@@ -5808,7 +5811,7 @@
           <w:numId w:val="1050"/>
         </w:numPr>
       </w:pPr>
-      <w:hyperlink r:id="rId48">
+      <w:hyperlink r:id="rId49">
         <w:r>
           <w:rPr>
             <w:rStyle w:val="Hyperlink"/>
@@ -5829,7 +5832,7 @@
       <w:pPr>
         <w:pStyle w:val="FirstParagraph"/>
       </w:pPr>
-      <w:hyperlink r:id="rId49">
+      <w:hyperlink r:id="rId50">
         <w:r>
           <w:rPr>
             <w:rStyle w:val="Hyperlink"/>
@@ -5862,7 +5865,7 @@
       <w:pPr>
         <w:pStyle w:val="BodyText"/>
       </w:pPr>
-      <w:hyperlink r:id="rId50">
+      <w:hyperlink r:id="rId51">
         <w:r>
           <w:rPr>
             <w:rStyle w:val="Hyperlink"/>
@@ -6510,7 +6513,7 @@
           <w:numId w:val="1053"/>
         </w:numPr>
       </w:pPr>
-      <w:hyperlink r:id="rId51">
+      <w:hyperlink r:id="rId52">
         <w:r>
           <w:rPr>
             <w:rStyle w:val="Hyperlink"/>
@@ -6655,7 +6658,7 @@
       <w:r>
         <w:t xml:space="preserve"> </w:t>
       </w:r>
-      <w:hyperlink r:id="rId47">
+      <w:hyperlink r:id="rId48">
         <w:r>
           <w:rPr>
             <w:rStyle w:val="Hyperlink"/>
@@ -6818,7 +6821,7 @@
       <w:r>
         <w:t xml:space="preserve"> </w:t>
       </w:r>
-      <w:hyperlink r:id="rId52">
+      <w:hyperlink r:id="rId53">
         <w:r>
           <w:rPr>
             <w:rStyle w:val="Hyperlink"/>
@@ -6849,7 +6852,7 @@
           <w:numId w:val="1056"/>
         </w:numPr>
       </w:pPr>
-      <w:hyperlink r:id="rId53">
+      <w:hyperlink r:id="rId54">
         <w:r>
           <w:rPr>
             <w:rStyle w:val="Hyperlink"/>
@@ -7001,7 +7004,7 @@
       <w:r>
         <w:t xml:space="preserve"> </w:t>
       </w:r>
-      <w:hyperlink r:id="rId47">
+      <w:hyperlink r:id="rId48">
         <w:r>
           <w:rPr>
             <w:rStyle w:val="Hyperlink"/>
@@ -7275,18 +7278,18 @@
           <wp:inline>
             <wp:extent cx="5074920" cy="8823960"/>
             <wp:effectExtent b="0" l="0" r="0" t="0"/>
-            <wp:docPr descr="" title="" id="55" name="Picture"/>
+            <wp:docPr descr="" title="" id="56" name="Picture"/>
             <a:graphic>
               <a:graphicData uri="http://schemas.openxmlformats.org/drawingml/2006/picture">
                 <pic:pic>
                   <pic:nvPicPr>
-                    <pic:cNvPr descr="u2_files/figure-docx/mermaid-figure-1.png" id="56" name="Picture"/>
+                    <pic:cNvPr descr="u2_files/figure-docx/mermaid-figure-1.png" id="57" name="Picture"/>
                     <pic:cNvPicPr>
                       <a:picLocks noChangeArrowheads="1" noChangeAspect="1"/>
                     </pic:cNvPicPr>
                   </pic:nvPicPr>
                   <pic:blipFill>
-                    <a:blip r:embed="rId54"/>
+                    <a:blip r:embed="rId55"/>
                     <a:stretch>
                       <a:fillRect/>
                     </a:stretch>
@@ -7467,7 +7470,7 @@
           <w:numId w:val="1058"/>
         </w:numPr>
       </w:pPr>
-      <w:hyperlink r:id="rId57">
+      <w:hyperlink r:id="rId58">
         <w:r>
           <w:rPr>
             <w:rStyle w:val="Hyperlink"/>
@@ -7488,7 +7491,7 @@
       <w:pPr>
         <w:pStyle w:val="FirstParagraph"/>
       </w:pPr>
-      <w:hyperlink r:id="rId58">
+      <w:hyperlink r:id="rId59">
         <w:r>
           <w:rPr>
             <w:rStyle w:val="Hyperlink"/>
@@ -7609,7 +7612,7 @@
       <w:r>
         <w:t xml:space="preserve"> </w:t>
       </w:r>
-      <w:hyperlink r:id="rId47">
+      <w:hyperlink r:id="rId48">
         <w:r>
           <w:rPr>
             <w:rStyle w:val="Hyperlink"/>
@@ -7766,7 +7769,7 @@
       <w:r>
         <w:t xml:space="preserve"> </w:t>
       </w:r>
-      <w:hyperlink r:id="rId47">
+      <w:hyperlink r:id="rId48">
         <w:r>
           <w:rPr>
             <w:rStyle w:val="Hyperlink"/>
@@ -7901,7 +7904,7 @@
           <w:numId w:val="1064"/>
         </w:numPr>
       </w:pPr>
-      <w:hyperlink r:id="rId59">
+      <w:hyperlink r:id="rId60">
         <w:r>
           <w:rPr>
             <w:rStyle w:val="Hyperlink"/>
@@ -7926,7 +7929,7 @@
           <w:numId w:val="1064"/>
         </w:numPr>
       </w:pPr>
-      <w:hyperlink r:id="rId60">
+      <w:hyperlink r:id="rId61">
         <w:r>
           <w:rPr>
             <w:rStyle w:val="Hyperlink"/>
@@ -7967,7 +7970,7 @@
           <w:numId w:val="1065"/>
         </w:numPr>
       </w:pPr>
-      <w:hyperlink r:id="rId61">
+      <w:hyperlink r:id="rId62">
         <w:r>
           <w:rPr>
             <w:rStyle w:val="Hyperlink"/>
@@ -7992,7 +7995,7 @@
           <w:numId w:val="1065"/>
         </w:numPr>
       </w:pPr>
-      <w:hyperlink r:id="rId62">
+      <w:hyperlink r:id="rId63">
         <w:r>
           <w:rPr>
             <w:rStyle w:val="Hyperlink"/>
@@ -8775,7 +8778,7 @@
           <w:numId w:val="1071"/>
         </w:numPr>
       </w:pPr>
-      <w:hyperlink r:id="rId63">
+      <w:hyperlink r:id="rId64">
         <w:r>
           <w:rPr>
             <w:rStyle w:val="Hyperlink"/>
@@ -8796,7 +8799,7 @@
       <w:pPr>
         <w:pStyle w:val="FirstParagraph"/>
       </w:pPr>
-      <w:hyperlink r:id="rId64">
+      <w:hyperlink r:id="rId65">
         <w:r>
           <w:rPr>
             <w:rStyle w:val="Hyperlink"/>
@@ -8813,7 +8816,7 @@
           <w:numId w:val="1072"/>
         </w:numPr>
       </w:pPr>
-      <w:hyperlink r:id="rId65">
+      <w:hyperlink r:id="rId66">
         <w:r>
           <w:rPr>
             <w:rStyle w:val="Hyperlink"/>
@@ -8834,7 +8837,7 @@
       <w:pPr>
         <w:pStyle w:val="FirstParagraph"/>
       </w:pPr>
-      <w:hyperlink r:id="rId66">
+      <w:hyperlink r:id="rId67">
         <w:r>
           <w:rPr>
             <w:rStyle w:val="Hyperlink"/>
@@ -8869,7 +8872,7 @@
           <w:numId w:val="1073"/>
         </w:numPr>
       </w:pPr>
-      <w:hyperlink r:id="rId67">
+      <w:hyperlink r:id="rId68">
         <w:r>
           <w:rPr>
             <w:rStyle w:val="Hyperlink"/>
@@ -8890,7 +8893,7 @@
       <w:pPr>
         <w:pStyle w:val="FirstParagraph"/>
       </w:pPr>
-      <w:hyperlink r:id="rId68">
+      <w:hyperlink r:id="rId69">
         <w:r>
           <w:rPr>
             <w:rStyle w:val="Hyperlink"/>
@@ -8925,7 +8928,7 @@
           <w:numId w:val="1074"/>
         </w:numPr>
       </w:pPr>
-      <w:hyperlink r:id="rId69">
+      <w:hyperlink r:id="rId70">
         <w:r>
           <w:rPr>
             <w:rStyle w:val="Hyperlink"/>
@@ -8946,7 +8949,7 @@
       <w:pPr>
         <w:pStyle w:val="FirstParagraph"/>
       </w:pPr>
-      <w:hyperlink r:id="rId70">
+      <w:hyperlink r:id="rId71">
         <w:r>
           <w:rPr>
             <w:rStyle w:val="Hyperlink"/>
@@ -9056,7 +9059,7 @@
           <w:numId w:val="1075"/>
         </w:numPr>
       </w:pPr>
-      <w:hyperlink r:id="rId71">
+      <w:hyperlink r:id="rId72">
         <w:r>
           <w:rPr>
             <w:rStyle w:val="Hyperlink"/>
@@ -9077,7 +9080,7 @@
       <w:pPr>
         <w:pStyle w:val="FirstParagraph"/>
       </w:pPr>
-      <w:hyperlink r:id="rId71">
+      <w:hyperlink r:id="rId72">
         <w:r>
           <w:rPr>
             <w:rStyle w:val="Hyperlink"/>
@@ -9153,37 +9156,6 @@
       </w:pPr>
       <w:r>
         <w:t xml:space="preserve">Online version</w:t>
-      </w:r>
-      <w:r>
-        <w:t xml:space="preserve"> </w:t>
-      </w:r>
-      <w:hyperlink r:id="rId72">
-        <w:r>
-          <w:rPr>
-            <w:rStyle w:val="Hyperlink"/>
-            <w:i/>
-            <w:iCs/>
-          </w:rPr>
-          <w:t xml:space="preserve">On Death and Dying</w:t>
-        </w:r>
-      </w:hyperlink>
-      <w:r>
-        <w:t xml:space="preserve"> </w:t>
-      </w:r>
-      <w:r>
-        <w:t xml:space="preserve">(1970)</w:t>
-      </w:r>
-    </w:p>
-    <w:p>
-      <w:pPr>
-        <w:pStyle w:val="Compact"/>
-        <w:numPr>
-          <w:ilvl w:val="0"/>
-          <w:numId w:val="1077"/>
-        </w:numPr>
-      </w:pPr>
-      <w:r>
-        <w:t xml:space="preserve">Physical copy</w:t>
       </w:r>
       <w:r>
         <w:t xml:space="preserve"> </w:t>
@@ -9207,6 +9179,37 @@
     </w:p>
     <w:p>
       <w:pPr>
+        <w:pStyle w:val="Compact"/>
+        <w:numPr>
+          <w:ilvl w:val="0"/>
+          <w:numId w:val="1077"/>
+        </w:numPr>
+      </w:pPr>
+      <w:r>
+        <w:t xml:space="preserve">Physical copy</w:t>
+      </w:r>
+      <w:r>
+        <w:t xml:space="preserve"> </w:t>
+      </w:r>
+      <w:hyperlink r:id="rId74">
+        <w:r>
+          <w:rPr>
+            <w:rStyle w:val="Hyperlink"/>
+            <w:i/>
+            <w:iCs/>
+          </w:rPr>
+          <w:t xml:space="preserve">On Death and Dying</w:t>
+        </w:r>
+      </w:hyperlink>
+      <w:r>
+        <w:t xml:space="preserve"> </w:t>
+      </w:r>
+      <w:r>
+        <w:t xml:space="preserve">(1970)</w:t>
+      </w:r>
+    </w:p>
+    <w:p>
+      <w:pPr>
         <w:pStyle w:val="FirstParagraph"/>
       </w:pPr>
       <w:r>
@@ -9731,7 +9734,7 @@
           <w:numId w:val="1080"/>
         </w:numPr>
       </w:pPr>
-      <w:hyperlink r:id="rId74">
+      <w:hyperlink r:id="rId75">
         <w:r>
           <w:rPr>
             <w:rStyle w:val="Hyperlink"/>
@@ -9756,7 +9759,7 @@
           <w:numId w:val="1080"/>
         </w:numPr>
       </w:pPr>
-      <w:hyperlink r:id="rId75">
+      <w:hyperlink r:id="rId76">
         <w:r>
           <w:rPr>
             <w:rStyle w:val="Hyperlink"/>
@@ -9899,7 +9902,7 @@
           <w:numId w:val="1081"/>
         </w:numPr>
       </w:pPr>
-      <w:hyperlink r:id="rId76">
+      <w:hyperlink r:id="rId77">
         <w:r>
           <w:rPr>
             <w:rStyle w:val="Hyperlink"/>
@@ -10132,7 +10135,7 @@
           <w:numId w:val="1083"/>
         </w:numPr>
       </w:pPr>
-      <w:hyperlink r:id="rId77">
+      <w:hyperlink r:id="rId78">
         <w:r>
           <w:rPr>
             <w:rStyle w:val="Hyperlink"/>
@@ -10373,7 +10376,7 @@
           <w:numId w:val="1085"/>
         </w:numPr>
       </w:pPr>
-      <w:hyperlink r:id="rId78">
+      <w:hyperlink r:id="rId79">
         <w:r>
           <w:rPr>
             <w:rStyle w:val="Hyperlink"/>
@@ -10568,7 +10571,7 @@
       <w:r>
         <w:t xml:space="preserve"> </w:t>
       </w:r>
-      <w:hyperlink r:id="rId79">
+      <w:hyperlink r:id="rId80">
         <w:r>
           <w:rPr>
             <w:rStyle w:val="Hyperlink"/>
@@ -10619,7 +10622,7 @@
           <w:numId w:val="1087"/>
         </w:numPr>
       </w:pPr>
-      <w:hyperlink r:id="rId80">
+      <w:hyperlink r:id="rId81">
         <w:r>
           <w:rPr>
             <w:rStyle w:val="Hyperlink"/>
@@ -10757,7 +10760,7 @@
           <w:numId w:val="1088"/>
         </w:numPr>
       </w:pPr>
-      <w:hyperlink r:id="rId81">
+      <w:hyperlink r:id="rId82">
         <w:r>
           <w:rPr>
             <w:rStyle w:val="Hyperlink"/>
@@ -11361,24 +11364,24 @@
       <w:pPr>
         <w:pStyle w:val="BodyText"/>
       </w:pPr>
-      <w:bookmarkStart w:id="85" w:name="fig_u3_1"/>
+      <w:bookmarkStart w:id="86" w:name="fig_u3_1"/>
       <w:r>
         <w:drawing>
           <wp:inline>
             <wp:extent cx="5334000" cy="3513710"/>
             <wp:effectExtent b="0" l="0" r="0" t="0"/>
-            <wp:docPr descr="" title="" id="83" name="Picture"/>
+            <wp:docPr descr="" title="" id="84" name="Picture"/>
             <a:graphic>
               <a:graphicData uri="http://schemas.openxmlformats.org/drawingml/2006/picture">
                 <pic:pic>
                   <pic:nvPicPr>
-                    <pic:cNvPr descr="assets/u3/image1.jpg" id="84" name="Picture"/>
+                    <pic:cNvPr descr="assets/u3/image1.jpg" id="85" name="Picture"/>
                     <pic:cNvPicPr>
                       <a:picLocks noChangeArrowheads="1" noChangeAspect="1"/>
                     </pic:cNvPicPr>
                   </pic:nvPicPr>
                   <pic:blipFill>
-                    <a:blip r:embed="rId82"/>
+                    <a:blip r:embed="rId83"/>
                     <a:stretch>
                       <a:fillRect/>
                     </a:stretch>
@@ -11404,7 +11407,7 @@
           </wp:inline>
         </w:drawing>
       </w:r>
-      <w:bookmarkEnd w:id="85"/>
+      <w:bookmarkEnd w:id="86"/>
     </w:p>
     <w:p>
       <w:pPr>
@@ -11634,7 +11637,7 @@
           <w:numId w:val="1092"/>
         </w:numPr>
       </w:pPr>
-      <w:hyperlink r:id="rId86">
+      <w:hyperlink r:id="rId87">
         <w:r>
           <w:rPr>
             <w:rStyle w:val="Hyperlink"/>
@@ -11825,7 +11828,7 @@
           <w:numId w:val="1095"/>
         </w:numPr>
       </w:pPr>
-      <w:hyperlink r:id="rId87">
+      <w:hyperlink r:id="rId88">
         <w:r>
           <w:rPr>
             <w:rStyle w:val="Hyperlink"/>
@@ -12804,7 +12807,7 @@
           <w:numId w:val="1102"/>
         </w:numPr>
       </w:pPr>
-      <w:hyperlink r:id="rId88">
+      <w:hyperlink r:id="rId89">
         <w:r>
           <w:rPr>
             <w:rStyle w:val="Hyperlink"/>
@@ -12825,7 +12828,7 @@
       <w:pPr>
         <w:pStyle w:val="FirstParagraph"/>
       </w:pPr>
-      <w:hyperlink r:id="rId89">
+      <w:hyperlink r:id="rId90">
         <w:r>
           <w:rPr>
             <w:rStyle w:val="Hyperlink"/>
@@ -12914,7 +12917,7 @@
           <w:numId w:val="1104"/>
         </w:numPr>
       </w:pPr>
-      <w:hyperlink r:id="rId90">
+      <w:hyperlink r:id="rId91">
         <w:r>
           <w:rPr>
             <w:rStyle w:val="Hyperlink"/>
@@ -12935,7 +12938,7 @@
       <w:pPr>
         <w:pStyle w:val="FirstParagraph"/>
       </w:pPr>
-      <w:hyperlink r:id="rId91">
+      <w:hyperlink r:id="rId92">
         <w:r>
           <w:rPr>
             <w:rStyle w:val="Hyperlink"/>
@@ -13056,7 +13059,7 @@
           <w:numId w:val="1105"/>
         </w:numPr>
       </w:pPr>
-      <w:hyperlink r:id="rId92">
+      <w:hyperlink r:id="rId93">
         <w:r>
           <w:rPr>
             <w:rStyle w:val="Hyperlink"/>
@@ -13235,7 +13238,7 @@
           <w:numId w:val="1107"/>
         </w:numPr>
       </w:pPr>
-      <w:hyperlink r:id="rId93">
+      <w:hyperlink r:id="rId94">
         <w:r>
           <w:rPr>
             <w:rStyle w:val="Hyperlink"/>
@@ -13256,7 +13259,7 @@
       <w:pPr>
         <w:pStyle w:val="FirstParagraph"/>
       </w:pPr>
-      <w:hyperlink r:id="rId94">
+      <w:hyperlink r:id="rId95">
         <w:r>
           <w:rPr>
             <w:rStyle w:val="Hyperlink"/>
@@ -13345,7 +13348,7 @@
           <w:numId w:val="1108"/>
         </w:numPr>
       </w:pPr>
-      <w:hyperlink r:id="rId95">
+      <w:hyperlink r:id="rId96">
         <w:r>
           <w:rPr>
             <w:rStyle w:val="Hyperlink"/>
@@ -13510,7 +13513,7 @@
           <w:numId w:val="1109"/>
         </w:numPr>
       </w:pPr>
-      <w:hyperlink r:id="rId96">
+      <w:hyperlink r:id="rId97">
         <w:r>
           <w:rPr>
             <w:rStyle w:val="Hyperlink"/>
@@ -13531,7 +13534,7 @@
       <w:pPr>
         <w:pStyle w:val="FirstParagraph"/>
       </w:pPr>
-      <w:hyperlink r:id="rId97">
+      <w:hyperlink r:id="rId98">
         <w:r>
           <w:rPr>
             <w:rStyle w:val="Hyperlink"/>
@@ -13586,7 +13589,7 @@
       <w:r>
         <w:t xml:space="preserve"> </w:t>
       </w:r>
-      <w:hyperlink r:id="rId98">
+      <w:hyperlink r:id="rId99">
         <w:r>
           <w:rPr>
             <w:rStyle w:val="Hyperlink"/>
@@ -13791,7 +13794,7 @@
           <w:numId w:val="1112"/>
         </w:numPr>
       </w:pPr>
-      <w:hyperlink r:id="rId99">
+      <w:hyperlink r:id="rId100">
         <w:r>
           <w:rPr>
             <w:rStyle w:val="Hyperlink"/>
@@ -13824,7 +13827,7 @@
           <w:numId w:val="1113"/>
         </w:numPr>
       </w:pPr>
-      <w:hyperlink r:id="rId100">
+      <w:hyperlink r:id="rId101">
         <w:r>
           <w:rPr>
             <w:rStyle w:val="Hyperlink"/>
@@ -13861,7 +13864,7 @@
       <w:pPr>
         <w:pStyle w:val="FirstParagraph"/>
       </w:pPr>
-      <w:hyperlink r:id="rId101">
+      <w:hyperlink r:id="rId102">
         <w:r>
           <w:rPr>
             <w:rStyle w:val="Hyperlink"/>
@@ -14128,7 +14131,7 @@
           <w:numId w:val="1115"/>
         </w:numPr>
       </w:pPr>
-      <w:hyperlink r:id="rId102">
+      <w:hyperlink r:id="rId103">
         <w:r>
           <w:rPr>
             <w:rStyle w:val="Hyperlink"/>
@@ -14149,7 +14152,7 @@
       <w:pPr>
         <w:pStyle w:val="FirstParagraph"/>
       </w:pPr>
-      <w:hyperlink r:id="rId103">
+      <w:hyperlink r:id="rId104">
         <w:r>
           <w:rPr>
             <w:rStyle w:val="Hyperlink"/>
@@ -14326,7 +14329,7 @@
           <w:numId w:val="1117"/>
         </w:numPr>
       </w:pPr>
-      <w:hyperlink r:id="rId104">
+      <w:hyperlink r:id="rId105">
         <w:r>
           <w:rPr>
             <w:rStyle w:val="Hyperlink"/>
@@ -14601,7 +14604,7 @@
           <w:numId w:val="1119"/>
         </w:numPr>
       </w:pPr>
-      <w:hyperlink r:id="rId105">
+      <w:hyperlink r:id="rId106">
         <w:r>
           <w:rPr>
             <w:rStyle w:val="Hyperlink"/>
@@ -14807,7 +14810,7 @@
       <w:r>
         <w:t xml:space="preserve"> </w:t>
       </w:r>
-      <w:hyperlink r:id="rId106">
+      <w:hyperlink r:id="rId107">
         <w:r>
           <w:rPr>
             <w:rStyle w:val="Hyperlink"/>
@@ -14959,7 +14962,7 @@
           <w:numId w:val="1123"/>
         </w:numPr>
       </w:pPr>
-      <w:hyperlink r:id="rId107">
+      <w:hyperlink r:id="rId108">
         <w:r>
           <w:rPr>
             <w:rStyle w:val="Hyperlink"/>
@@ -14980,7 +14983,7 @@
       <w:pPr>
         <w:pStyle w:val="FirstParagraph"/>
       </w:pPr>
-      <w:hyperlink r:id="rId108">
+      <w:hyperlink r:id="rId109">
         <w:r>
           <w:rPr>
             <w:rStyle w:val="Hyperlink"/>
@@ -15167,7 +15170,7 @@
           <w:numId w:val="1125"/>
         </w:numPr>
       </w:pPr>
-      <w:hyperlink r:id="rId109">
+      <w:hyperlink r:id="rId110">
         <w:r>
           <w:rPr>
             <w:rStyle w:val="Hyperlink"/>
@@ -15280,7 +15283,7 @@
           <w:numId w:val="1127"/>
         </w:numPr>
       </w:pPr>
-      <w:hyperlink r:id="rId110">
+      <w:hyperlink r:id="rId111">
         <w:r>
           <w:rPr>
             <w:rStyle w:val="Hyperlink"/>
@@ -15509,7 +15512,7 @@
           <w:numId w:val="1129"/>
         </w:numPr>
       </w:pPr>
-      <w:hyperlink r:id="rId111">
+      <w:hyperlink r:id="rId112">
         <w:r>
           <w:rPr>
             <w:rStyle w:val="Hyperlink"/>
@@ -15530,7 +15533,7 @@
       <w:pPr>
         <w:pStyle w:val="FirstParagraph"/>
       </w:pPr>
-      <w:hyperlink r:id="rId112">
+      <w:hyperlink r:id="rId113">
         <w:r>
           <w:rPr>
             <w:rStyle w:val="Hyperlink"/>
@@ -15651,7 +15654,7 @@
           <w:numId w:val="1131"/>
         </w:numPr>
       </w:pPr>
-      <w:hyperlink r:id="rId113">
+      <w:hyperlink r:id="rId114">
         <w:r>
           <w:rPr>
             <w:rStyle w:val="Hyperlink"/>
@@ -15832,7 +15835,7 @@
           <w:numId w:val="1133"/>
         </w:numPr>
       </w:pPr>
-      <w:hyperlink r:id="rId114">
+      <w:hyperlink r:id="rId115">
         <w:r>
           <w:rPr>
             <w:rStyle w:val="Hyperlink"/>
@@ -16071,7 +16074,7 @@
           <w:numId w:val="1135"/>
         </w:numPr>
       </w:pPr>
-      <w:hyperlink r:id="rId115">
+      <w:hyperlink r:id="rId116">
         <w:r>
           <w:rPr>
             <w:rStyle w:val="Hyperlink"/>
@@ -16096,7 +16099,7 @@
           <w:numId w:val="1135"/>
         </w:numPr>
       </w:pPr>
-      <w:hyperlink r:id="rId116">
+      <w:hyperlink r:id="rId117">
         <w:r>
           <w:rPr>
             <w:rStyle w:val="Hyperlink"/>
@@ -16133,7 +16136,7 @@
           <w:numId w:val="1136"/>
         </w:numPr>
       </w:pPr>
-      <w:hyperlink r:id="rId117">
+      <w:hyperlink r:id="rId118">
         <w:r>
           <w:rPr>
             <w:rStyle w:val="Hyperlink"/>
@@ -16170,7 +16173,7 @@
           <w:numId w:val="1137"/>
         </w:numPr>
       </w:pPr>
-      <w:hyperlink r:id="rId118">
+      <w:hyperlink r:id="rId119">
         <w:r>
           <w:rPr>
             <w:rStyle w:val="Hyperlink"/>
@@ -16207,7 +16210,7 @@
           <w:numId w:val="1138"/>
         </w:numPr>
       </w:pPr>
-      <w:hyperlink r:id="rId119">
+      <w:hyperlink r:id="rId120">
         <w:r>
           <w:rPr>
             <w:rStyle w:val="Hyperlink"/>
@@ -16232,7 +16235,7 @@
           <w:numId w:val="1138"/>
         </w:numPr>
       </w:pPr>
-      <w:hyperlink r:id="rId120">
+      <w:hyperlink r:id="rId121">
         <w:r>
           <w:rPr>
             <w:rStyle w:val="Hyperlink"/>
@@ -16333,7 +16336,7 @@
       <w:pPr>
         <w:pStyle w:val="BodyText"/>
       </w:pPr>
-      <w:hyperlink r:id="rId121">
+      <w:hyperlink r:id="rId122">
         <w:r>
           <w:rPr>
             <w:rStyle w:val="Hyperlink"/>
@@ -16422,7 +16425,7 @@
           <w:numId w:val="1139"/>
         </w:numPr>
       </w:pPr>
-      <w:hyperlink r:id="rId122">
+      <w:hyperlink r:id="rId123">
         <w:r>
           <w:rPr>
             <w:rStyle w:val="Hyperlink"/>
@@ -16479,7 +16482,7 @@
       <w:pPr>
         <w:pStyle w:val="BodyText"/>
       </w:pPr>
-      <w:hyperlink r:id="rId123">
+      <w:hyperlink r:id="rId124">
         <w:r>
           <w:rPr>
             <w:rStyle w:val="Hyperlink"/>
@@ -16580,7 +16583,7 @@
       <w:pPr>
         <w:pStyle w:val="BodyText"/>
       </w:pPr>
-      <w:hyperlink r:id="rId124">
+      <w:hyperlink r:id="rId125">
         <w:r>
           <w:rPr>
             <w:rStyle w:val="Hyperlink"/>
@@ -17339,7 +17342,7 @@
       <w:r>
         <w:t xml:space="preserve"> </w:t>
       </w:r>
-      <w:hyperlink r:id="rId125">
+      <w:hyperlink r:id="rId126">
         <w:r>
           <w:rPr>
             <w:rStyle w:val="Hyperlink"/>
@@ -17373,7 +17376,7 @@
           <w:numId w:val="1145"/>
         </w:numPr>
       </w:pPr>
-      <w:hyperlink r:id="rId126">
+      <w:hyperlink r:id="rId127">
         <w:r>
           <w:rPr>
             <w:rStyle w:val="Hyperlink"/>
@@ -17394,7 +17397,7 @@
       <w:pPr>
         <w:pStyle w:val="FirstParagraph"/>
       </w:pPr>
-      <w:hyperlink r:id="rId127">
+      <w:hyperlink r:id="rId128">
         <w:r>
           <w:rPr>
             <w:rStyle w:val="Hyperlink"/>
@@ -17505,7 +17508,7 @@
       <w:r>
         <w:t xml:space="preserve"> </w:t>
       </w:r>
-      <w:hyperlink r:id="rId128">
+      <w:hyperlink r:id="rId129">
         <w:r>
           <w:rPr>
             <w:rStyle w:val="Hyperlink"/>
@@ -17734,7 +17737,7 @@
           <w:numId w:val="1149"/>
         </w:numPr>
       </w:pPr>
-      <w:hyperlink r:id="rId129">
+      <w:hyperlink r:id="rId130">
         <w:r>
           <w:rPr>
             <w:rStyle w:val="Hyperlink"/>
@@ -17945,7 +17948,7 @@
       <w:pPr>
         <w:pStyle w:val="BodyText"/>
       </w:pPr>
-      <w:hyperlink r:id="rId130">
+      <w:hyperlink r:id="rId131">
         <w:r>
           <w:rPr>
             <w:rStyle w:val="Hyperlink"/>
@@ -18034,7 +18037,7 @@
           <w:numId w:val="1151"/>
         </w:numPr>
       </w:pPr>
-      <w:hyperlink r:id="rId131">
+      <w:hyperlink r:id="rId132">
         <w:r>
           <w:rPr>
             <w:rStyle w:val="Hyperlink"/>
@@ -18055,7 +18058,7 @@
       <w:pPr>
         <w:pStyle w:val="FirstParagraph"/>
       </w:pPr>
-      <w:hyperlink r:id="rId132">
+      <w:hyperlink r:id="rId133">
         <w:r>
           <w:rPr>
             <w:rStyle w:val="Hyperlink"/>
@@ -18156,7 +18159,7 @@
           <w:numId w:val="1152"/>
         </w:numPr>
       </w:pPr>
-      <w:hyperlink r:id="rId133">
+      <w:hyperlink r:id="rId134">
         <w:r>
           <w:rPr>
             <w:rStyle w:val="Hyperlink"/>
@@ -18177,7 +18180,7 @@
       <w:pPr>
         <w:pStyle w:val="FirstParagraph"/>
       </w:pPr>
-      <w:hyperlink r:id="rId134">
+      <w:hyperlink r:id="rId135">
         <w:r>
           <w:rPr>
             <w:rStyle w:val="Hyperlink"/>
@@ -18282,7 +18285,7 @@
           <w:numId w:val="1154"/>
         </w:numPr>
       </w:pPr>
-      <w:hyperlink r:id="rId135">
+      <w:hyperlink r:id="rId136">
         <w:r>
           <w:rPr>
             <w:rStyle w:val="Hyperlink"/>
@@ -18303,7 +18306,7 @@
       <w:pPr>
         <w:pStyle w:val="FirstParagraph"/>
       </w:pPr>
-      <w:hyperlink r:id="rId136">
+      <w:hyperlink r:id="rId137">
         <w:r>
           <w:rPr>
             <w:rStyle w:val="Hyperlink"/>
@@ -18497,7 +18500,7 @@
           <w:numId w:val="1156"/>
         </w:numPr>
       </w:pPr>
-      <w:hyperlink r:id="rId137">
+      <w:hyperlink r:id="rId138">
         <w:r>
           <w:rPr>
             <w:rStyle w:val="Hyperlink"/>
@@ -18752,7 +18755,7 @@
           <w:numId w:val="1158"/>
         </w:numPr>
       </w:pPr>
-      <w:hyperlink r:id="rId138">
+      <w:hyperlink r:id="rId139">
         <w:r>
           <w:rPr>
             <w:rStyle w:val="Hyperlink"/>
@@ -18773,7 +18776,7 @@
       <w:pPr>
         <w:pStyle w:val="FirstParagraph"/>
       </w:pPr>
-      <w:hyperlink r:id="rId138">
+      <w:hyperlink r:id="rId139">
         <w:r>
           <w:rPr>
             <w:rStyle w:val="Hyperlink"/>
@@ -18918,7 +18921,7 @@
           <w:numId w:val="1160"/>
         </w:numPr>
       </w:pPr>
-      <w:hyperlink r:id="rId139">
+      <w:hyperlink r:id="rId140">
         <w:r>
           <w:rPr>
             <w:rStyle w:val="Hyperlink"/>
@@ -19140,7 +19143,7 @@
           <w:numId w:val="1162"/>
         </w:numPr>
       </w:pPr>
-      <w:hyperlink r:id="rId140">
+      <w:hyperlink r:id="rId141">
         <w:r>
           <w:rPr>
             <w:rStyle w:val="Hyperlink"/>
@@ -19275,7 +19278,7 @@
           <w:numId w:val="1164"/>
         </w:numPr>
       </w:pPr>
-      <w:hyperlink r:id="rId141">
+      <w:hyperlink r:id="rId142">
         <w:r>
           <w:rPr>
             <w:rStyle w:val="Hyperlink"/>
@@ -19296,7 +19299,7 @@
       <w:pPr>
         <w:pStyle w:val="FirstParagraph"/>
       </w:pPr>
-      <w:hyperlink r:id="rId142">
+      <w:hyperlink r:id="rId143">
         <w:r>
           <w:rPr>
             <w:rStyle w:val="Hyperlink"/>
@@ -19476,7 +19479,7 @@
       <w:pPr>
         <w:pStyle w:val="BodyText"/>
       </w:pPr>
-      <w:hyperlink r:id="rId143">
+      <w:hyperlink r:id="rId144">
         <w:r>
           <w:rPr>
             <w:rStyle w:val="Hyperlink"/>
@@ -20287,7 +20290,7 @@
       <w:pPr>
         <w:pStyle w:val="BodyText"/>
       </w:pPr>
-      <w:hyperlink r:id="rId144">
+      <w:hyperlink r:id="rId145">
         <w:r>
           <w:rPr>
             <w:rStyle w:val="Hyperlink"/>
@@ -20324,7 +20327,7 @@
       <w:pPr>
         <w:pStyle w:val="BodyText"/>
       </w:pPr>
-      <w:hyperlink r:id="rId145">
+      <w:hyperlink r:id="rId146">
         <w:r>
           <w:rPr>
             <w:rStyle w:val="Hyperlink"/>
@@ -20417,7 +20420,7 @@
           <w:numId w:val="1171"/>
         </w:numPr>
       </w:pPr>
-      <w:hyperlink r:id="rId146">
+      <w:hyperlink r:id="rId147">
         <w:r>
           <w:rPr>
             <w:rStyle w:val="Hyperlink"/>
@@ -20438,7 +20441,7 @@
       <w:pPr>
         <w:pStyle w:val="FirstParagraph"/>
       </w:pPr>
-      <w:hyperlink r:id="rId147">
+      <w:hyperlink r:id="rId148">
         <w:r>
           <w:rPr>
             <w:rStyle w:val="Hyperlink"/>
@@ -20571,7 +20574,7 @@
           <w:numId w:val="1173"/>
         </w:numPr>
       </w:pPr>
-      <w:hyperlink r:id="rId148">
+      <w:hyperlink r:id="rId149">
         <w:r>
           <w:rPr>
             <w:rStyle w:val="Hyperlink"/>
@@ -20608,7 +20611,7 @@
       <w:pPr>
         <w:pStyle w:val="FirstParagraph"/>
       </w:pPr>
-      <w:hyperlink r:id="rId149">
+      <w:hyperlink r:id="rId150">
         <w:r>
           <w:rPr>
             <w:rStyle w:val="Hyperlink"/>
@@ -20716,7 +20719,7 @@
           <w:numId w:val="1175"/>
         </w:numPr>
       </w:pPr>
-      <w:hyperlink r:id="rId150">
+      <w:hyperlink r:id="rId151">
         <w:r>
           <w:rPr>
             <w:rStyle w:val="Hyperlink"/>
@@ -20829,7 +20832,7 @@
           <w:numId w:val="1176"/>
         </w:numPr>
       </w:pPr>
-      <w:hyperlink r:id="rId151">
+      <w:hyperlink r:id="rId152">
         <w:r>
           <w:rPr>
             <w:rStyle w:val="Hyperlink"/>
@@ -20860,7 +20863,7 @@
       <w:pPr>
         <w:pStyle w:val="FirstParagraph"/>
       </w:pPr>
-      <w:hyperlink r:id="rId152">
+      <w:hyperlink r:id="rId153">
         <w:r>
           <w:rPr>
             <w:rStyle w:val="Hyperlink"/>
@@ -21109,7 +21112,7 @@
           <w:numId w:val="1178"/>
         </w:numPr>
       </w:pPr>
-      <w:hyperlink r:id="rId153">
+      <w:hyperlink r:id="rId154">
         <w:r>
           <w:rPr>
             <w:rStyle w:val="Hyperlink"/>
@@ -21425,7 +21428,7 @@
           <w:numId w:val="1180"/>
         </w:numPr>
       </w:pPr>
-      <w:hyperlink r:id="rId154">
+      <w:hyperlink r:id="rId155">
         <w:r>
           <w:rPr>
             <w:rStyle w:val="Hyperlink"/>
@@ -21581,7 +21584,7 @@
           <w:numId w:val="1181"/>
         </w:numPr>
       </w:pPr>
-      <w:hyperlink r:id="rId155">
+      <w:hyperlink r:id="rId156">
         <w:r>
           <w:rPr>
             <w:rStyle w:val="Hyperlink"/>
@@ -21690,7 +21693,7 @@
           <w:numId w:val="1182"/>
         </w:numPr>
       </w:pPr>
-      <w:hyperlink r:id="rId156">
+      <w:hyperlink r:id="rId157">
         <w:r>
           <w:rPr>
             <w:rStyle w:val="Hyperlink"/>
@@ -21787,7 +21790,7 @@
           <w:numId w:val="1184"/>
         </w:numPr>
       </w:pPr>
-      <w:hyperlink r:id="rId157">
+      <w:hyperlink r:id="rId158">
         <w:r>
           <w:rPr>
             <w:rStyle w:val="Hyperlink"/>
@@ -21960,7 +21963,7 @@
           <w:numId w:val="1186"/>
         </w:numPr>
       </w:pPr>
-      <w:hyperlink r:id="rId158">
+      <w:hyperlink r:id="rId159">
         <w:r>
           <w:rPr>
             <w:rStyle w:val="Hyperlink"/>
@@ -22107,7 +22110,7 @@
           <w:numId w:val="1188"/>
         </w:numPr>
       </w:pPr>
-      <w:hyperlink r:id="rId159">
+      <w:hyperlink r:id="rId160">
         <w:r>
           <w:rPr>
             <w:rStyle w:val="Hyperlink"/>
@@ -22268,317 +22271,6 @@
         <w:numPr>
           <w:ilvl w:val="0"/>
           <w:numId w:val="1190"/>
-        </w:numPr>
-      </w:pPr>
-      <w:hyperlink r:id="rId160">
-        <w:r>
-          <w:rPr>
-            <w:rStyle w:val="Hyperlink"/>
-            <w:i/>
-            <w:iCs/>
-          </w:rPr>
-          <w:t xml:space="preserve">Counseling and Christianity: Five Approaches</w:t>
-        </w:r>
-      </w:hyperlink>
-      <w:r>
-        <w:t xml:space="preserve"> </w:t>
-      </w:r>
-      <w:r>
-        <w:t xml:space="preserve">(2012)</w:t>
-      </w:r>
-    </w:p>
-    <w:p>
-      <w:pPr>
-        <w:pStyle w:val="FirstParagraph"/>
-      </w:pPr>
-      <w:r>
-        <w:rPr>
-          <w:color w:val="6ecfb1"/>
-          <w:sz w:val="24"/>
-          <w:szCs w:val="24"/>
-          <w:b/>
-        </w:rPr>
-        <w:t xml:space="preserve">&lt;End learning-activity&gt;</w:t>
-      </w:r>
-    </w:p>
-    <w:p>
-      <w:pPr>
-        <w:pStyle w:val="Heading3"/>
-      </w:pPr>
-      <w:r>
-        <w:t xml:space="preserve">6.1.11 Activity: Reflect</w:t>
-      </w:r>
-    </w:p>
-    <w:p>
-      <w:pPr>
-        <w:pStyle w:val="FirstParagraph"/>
-      </w:pPr>
-      <w:r>
-        <w:rPr>
-          <w:color w:val="6ecfb1"/>
-          <w:sz w:val="24"/>
-          <w:szCs w:val="24"/>
-          <w:b/>
-        </w:rPr>
-        <w:t xml:space="preserve">&lt;Begin learning-activity&gt;</w:t>
-      </w:r>
-    </w:p>
-    <w:p>
-      <w:pPr>
-        <w:pStyle w:val="BodyText"/>
-      </w:pPr>
-      <w:r>
-        <w:rPr>
-          <w:sz w:val="16"/>
-          <w:szCs w:val="16"/>
-          <w:b/>
-        </w:rPr>
-        <w:t xml:space="preserve">Estimated Time</w:t>
-      </w:r>
-      <w:r>
-        <w:rPr>
-          <w:sz w:val="16"/>
-          <w:szCs w:val="16"/>
-          <w:b/>
-        </w:rPr>
-        <w:t xml:space="preserve">: </w:t>
-      </w:r>
-      <w:r>
-        <w:rPr>
-          <w:sz w:val="16"/>
-          <w:szCs w:val="16"/>
-        </w:rPr>
-        <w:t xml:space="preserve"/>
-      </w:r>
-    </w:p>
-    <w:p>
-      <w:pPr>
-        <w:pStyle w:val="BodyText"/>
-      </w:pPr>
-      <w:r>
-        <w:t xml:space="preserve">Take a moment to write down in paragraph or point form some of your reactions to what you have read. Apply it to your practice.</w:t>
-      </w:r>
-    </w:p>
-    <w:p>
-      <w:pPr>
-        <w:pStyle w:val="Compact"/>
-        <w:numPr>
-          <w:ilvl w:val="0"/>
-          <w:numId w:val="1191"/>
-        </w:numPr>
-      </w:pPr>
-      <w:r>
-        <w:t xml:space="preserve">When you interact with your clients or in your place of work, do you see psychology and your faith as two separate entities?</w:t>
-      </w:r>
-    </w:p>
-    <w:p>
-      <w:pPr>
-        <w:pStyle w:val="Compact"/>
-        <w:numPr>
-          <w:ilvl w:val="0"/>
-          <w:numId w:val="1191"/>
-        </w:numPr>
-      </w:pPr>
-      <w:r>
-        <w:t xml:space="preserve">Do you feel comfortable bringing your faith into your work (when it is ethically appropriate)?</w:t>
-      </w:r>
-    </w:p>
-    <w:p>
-      <w:pPr>
-        <w:pStyle w:val="Compact"/>
-        <w:numPr>
-          <w:ilvl w:val="0"/>
-          <w:numId w:val="1191"/>
-        </w:numPr>
-      </w:pPr>
-      <w:r>
-        <w:t xml:space="preserve">Does your work challenge your faith sometimes?</w:t>
-      </w:r>
-    </w:p>
-    <w:p>
-      <w:pPr>
-        <w:pStyle w:val="Compact"/>
-        <w:numPr>
-          <w:ilvl w:val="0"/>
-          <w:numId w:val="1191"/>
-        </w:numPr>
-      </w:pPr>
-      <w:r>
-        <w:t xml:space="preserve">Does your faith challenge your work? At work do you place more value on science or on your faith?</w:t>
-      </w:r>
-    </w:p>
-    <w:p>
-      <w:pPr>
-        <w:pStyle w:val="FirstParagraph"/>
-      </w:pPr>
-      <w:r>
-        <w:rPr>
-          <w:color w:val="6ecfb1"/>
-          <w:sz w:val="24"/>
-          <w:szCs w:val="24"/>
-          <w:b/>
-        </w:rPr>
-        <w:t xml:space="preserve">&lt;End learning-activity&gt;</w:t>
-      </w:r>
-    </w:p>
-    <w:p>
-      <w:pPr>
-        <w:pStyle w:val="Heading2"/>
-      </w:pPr>
-      <w:r>
-        <w:t xml:space="preserve">6.2 Clinical Implications</w:t>
-      </w:r>
-    </w:p>
-    <w:p>
-      <w:pPr>
-        <w:pStyle w:val="FirstParagraph"/>
-      </w:pPr>
-      <w:r>
-        <w:t xml:space="preserve">Our next step will be to investigate the implications for the therapy room of the approaches described above. As part of this course we will read from the book</w:t>
-      </w:r>
-      <w:r>
-        <w:t xml:space="preserve"> </w:t>
-      </w:r>
-      <w:r>
-        <w:rPr>
-          <w:i/>
-          <w:iCs/>
-        </w:rPr>
-        <w:t xml:space="preserve">Counseling and Christianity: Five Approaches</w:t>
-      </w:r>
-      <w:r>
-        <w:t xml:space="preserve"> </w:t>
-      </w:r>
-      <w:r>
-        <w:t xml:space="preserve">(Johnson, 2012)</w:t>
-      </w:r>
-      <w:r>
-        <w:t xml:space="preserve">. The sections that explain how each view might apply in a therapist’s work are available to you as PDFs. The clinical case study of Jake will be incorporated into each view.</w:t>
-      </w:r>
-    </w:p>
-    <w:p>
-      <w:pPr>
-        <w:pStyle w:val="BodyText"/>
-      </w:pPr>
-      <w:r>
-        <w:t xml:space="preserve">It is important to note before we begin that regardless of the integration approach that you choose for your own practice (if you choose one at all), as therapists it is our ethical duty to never bring up faith in the room unless the client indicates that they are interested.</w:t>
-      </w:r>
-      <w:r>
-        <w:t xml:space="preserve"> </w:t>
-      </w:r>
-      <w:r>
-        <w:rPr>
-          <w:i/>
-          <w:iCs/>
-        </w:rPr>
-        <w:t xml:space="preserve">Critical Issues in Human Services</w:t>
-      </w:r>
-      <w:r>
-        <w:t xml:space="preserve">, a course that we offer in SOCI 400, focuses on this subject. We will discuss this ethical consideration in more detail if you have not taken this course yet. As a Christian therapist or agency, we must respect the autonomy of the client (the ethical principle) and never assume that this is exactly what the client is seeking.</w:t>
-      </w:r>
-    </w:p>
-    <w:p>
-      <w:pPr>
-        <w:pStyle w:val="Heading3"/>
-      </w:pPr>
-      <w:r>
-        <w:t xml:space="preserve">6.2.1 Activity: Read |</w:t>
-      </w:r>
-      <w:r>
-        <w:t xml:space="preserve"> </w:t>
-      </w:r>
-      <w:r>
-        <w:rPr>
-          <w:i/>
-          <w:iCs/>
-        </w:rPr>
-        <w:t xml:space="preserve">Counseling and Christianity: Five Approaches,</w:t>
-      </w:r>
-      <w:r>
-        <w:t xml:space="preserve"> </w:t>
-      </w:r>
-      <w:r>
-        <w:t xml:space="preserve">pp. 60–64, 72–74, and 81</w:t>
-      </w:r>
-    </w:p>
-    <w:p>
-      <w:pPr>
-        <w:pStyle w:val="FirstParagraph"/>
-      </w:pPr>
-      <w:r>
-        <w:rPr>
-          <w:color w:val="6ecfb1"/>
-          <w:sz w:val="24"/>
-          <w:szCs w:val="24"/>
-          <w:b/>
-        </w:rPr>
-        <w:t xml:space="preserve">&lt;Begin learning-activity&gt;</w:t>
-      </w:r>
-    </w:p>
-    <w:p>
-      <w:pPr>
-        <w:pStyle w:val="BodyText"/>
-      </w:pPr>
-      <w:r>
-        <w:rPr>
-          <w:sz w:val="16"/>
-          <w:szCs w:val="16"/>
-          <w:b/>
-        </w:rPr>
-        <w:t xml:space="preserve">Estimated Time</w:t>
-      </w:r>
-      <w:r>
-        <w:rPr>
-          <w:sz w:val="16"/>
-          <w:szCs w:val="16"/>
-          <w:b/>
-        </w:rPr>
-        <w:t xml:space="preserve">: </w:t>
-      </w:r>
-      <w:r>
-        <w:rPr>
-          <w:sz w:val="16"/>
-          <w:szCs w:val="16"/>
-        </w:rPr>
-        <w:t xml:space="preserve"/>
-      </w:r>
-    </w:p>
-    <w:p>
-      <w:pPr>
-        <w:pStyle w:val="BodyText"/>
-      </w:pPr>
-      <w:r>
-        <w:t xml:space="preserve">Please refer to the reading provided for an example of how the levels of explanation view would look in a therapy room. It can be difficult to determine how each of the five approaches will affect the way we work, which is why</w:t>
-      </w:r>
-      <w:r>
-        <w:t xml:space="preserve"> </w:t>
-      </w:r>
-      <w:r>
-        <w:rPr>
-          <w:i/>
-          <w:iCs/>
-        </w:rPr>
-        <w:t xml:space="preserve">Counseling and Christianity: Five Approaches</w:t>
-      </w:r>
-      <w:r>
-        <w:t xml:space="preserve"> </w:t>
-      </w:r>
-      <w:r>
-        <w:t xml:space="preserve">(Johnson, 2012)</w:t>
-      </w:r>
-      <w:r>
-        <w:t xml:space="preserve"> </w:t>
-      </w:r>
-      <w:r>
-        <w:t xml:space="preserve">addresses this issue. By providing these examples, it is hoped that the knowledge will be better integrated into practice.</w:t>
-      </w:r>
-    </w:p>
-    <w:p>
-      <w:pPr>
-        <w:pStyle w:val="Compact"/>
-        <w:numPr>
-          <w:ilvl w:val="0"/>
-          <w:numId w:val="1192"/>
         </w:numPr>
       </w:pPr>
       <w:hyperlink r:id="rId161">
@@ -22600,13 +22292,324 @@
     </w:p>
     <w:p>
       <w:pPr>
+        <w:pStyle w:val="FirstParagraph"/>
+      </w:pPr>
+      <w:r>
+        <w:rPr>
+          <w:color w:val="6ecfb1"/>
+          <w:sz w:val="24"/>
+          <w:szCs w:val="24"/>
+          <w:b/>
+        </w:rPr>
+        <w:t xml:space="preserve">&lt;End learning-activity&gt;</w:t>
+      </w:r>
+    </w:p>
+    <w:p>
+      <w:pPr>
+        <w:pStyle w:val="Heading3"/>
+      </w:pPr>
+      <w:r>
+        <w:t xml:space="preserve">6.1.11 Activity: Reflect</w:t>
+      </w:r>
+    </w:p>
+    <w:p>
+      <w:pPr>
+        <w:pStyle w:val="FirstParagraph"/>
+      </w:pPr>
+      <w:r>
+        <w:rPr>
+          <w:color w:val="6ecfb1"/>
+          <w:sz w:val="24"/>
+          <w:szCs w:val="24"/>
+          <w:b/>
+        </w:rPr>
+        <w:t xml:space="preserve">&lt;Begin learning-activity&gt;</w:t>
+      </w:r>
+    </w:p>
+    <w:p>
+      <w:pPr>
+        <w:pStyle w:val="BodyText"/>
+      </w:pPr>
+      <w:r>
+        <w:rPr>
+          <w:sz w:val="16"/>
+          <w:szCs w:val="16"/>
+          <w:b/>
+        </w:rPr>
+        <w:t xml:space="preserve">Estimated Time</w:t>
+      </w:r>
+      <w:r>
+        <w:rPr>
+          <w:sz w:val="16"/>
+          <w:szCs w:val="16"/>
+          <w:b/>
+        </w:rPr>
+        <w:t xml:space="preserve">: </w:t>
+      </w:r>
+      <w:r>
+        <w:rPr>
+          <w:sz w:val="16"/>
+          <w:szCs w:val="16"/>
+        </w:rPr>
+        <w:t xml:space="preserve"/>
+      </w:r>
+    </w:p>
+    <w:p>
+      <w:pPr>
+        <w:pStyle w:val="BodyText"/>
+      </w:pPr>
+      <w:r>
+        <w:t xml:space="preserve">Take a moment to write down in paragraph or point form some of your reactions to what you have read. Apply it to your practice.</w:t>
+      </w:r>
+    </w:p>
+    <w:p>
+      <w:pPr>
+        <w:pStyle w:val="Compact"/>
+        <w:numPr>
+          <w:ilvl w:val="0"/>
+          <w:numId w:val="1191"/>
+        </w:numPr>
+      </w:pPr>
+      <w:r>
+        <w:t xml:space="preserve">When you interact with your clients or in your place of work, do you see psychology and your faith as two separate entities?</w:t>
+      </w:r>
+    </w:p>
+    <w:p>
+      <w:pPr>
+        <w:pStyle w:val="Compact"/>
+        <w:numPr>
+          <w:ilvl w:val="0"/>
+          <w:numId w:val="1191"/>
+        </w:numPr>
+      </w:pPr>
+      <w:r>
+        <w:t xml:space="preserve">Do you feel comfortable bringing your faith into your work (when it is ethically appropriate)?</w:t>
+      </w:r>
+    </w:p>
+    <w:p>
+      <w:pPr>
+        <w:pStyle w:val="Compact"/>
+        <w:numPr>
+          <w:ilvl w:val="0"/>
+          <w:numId w:val="1191"/>
+        </w:numPr>
+      </w:pPr>
+      <w:r>
+        <w:t xml:space="preserve">Does your work challenge your faith sometimes?</w:t>
+      </w:r>
+    </w:p>
+    <w:p>
+      <w:pPr>
+        <w:pStyle w:val="Compact"/>
+        <w:numPr>
+          <w:ilvl w:val="0"/>
+          <w:numId w:val="1191"/>
+        </w:numPr>
+      </w:pPr>
+      <w:r>
+        <w:t xml:space="preserve">Does your faith challenge your work? At work do you place more value on science or on your faith?</w:t>
+      </w:r>
+    </w:p>
+    <w:p>
+      <w:pPr>
+        <w:pStyle w:val="FirstParagraph"/>
+      </w:pPr>
+      <w:r>
+        <w:rPr>
+          <w:color w:val="6ecfb1"/>
+          <w:sz w:val="24"/>
+          <w:szCs w:val="24"/>
+          <w:b/>
+        </w:rPr>
+        <w:t xml:space="preserve">&lt;End learning-activity&gt;</w:t>
+      </w:r>
+    </w:p>
+    <w:p>
+      <w:pPr>
+        <w:pStyle w:val="Heading2"/>
+      </w:pPr>
+      <w:r>
+        <w:t xml:space="preserve">6.2 Clinical Implications</w:t>
+      </w:r>
+    </w:p>
+    <w:p>
+      <w:pPr>
+        <w:pStyle w:val="FirstParagraph"/>
+      </w:pPr>
+      <w:r>
+        <w:t xml:space="preserve">Our next step will be to investigate the implications for the therapy room of the approaches described above. As part of this course we will read from the book</w:t>
+      </w:r>
+      <w:r>
+        <w:t xml:space="preserve"> </w:t>
+      </w:r>
+      <w:r>
+        <w:rPr>
+          <w:i/>
+          <w:iCs/>
+        </w:rPr>
+        <w:t xml:space="preserve">Counseling and Christianity: Five Approaches</w:t>
+      </w:r>
+      <w:r>
+        <w:t xml:space="preserve"> </w:t>
+      </w:r>
+      <w:r>
+        <w:t xml:space="preserve">(Johnson, 2012)</w:t>
+      </w:r>
+      <w:r>
+        <w:t xml:space="preserve">. The sections that explain how each view might apply in a therapist’s work are available to you as PDFs. The clinical case study of Jake will be incorporated into each view.</w:t>
+      </w:r>
+    </w:p>
+    <w:p>
+      <w:pPr>
+        <w:pStyle w:val="BodyText"/>
+      </w:pPr>
+      <w:r>
+        <w:t xml:space="preserve">It is important to note before we begin that regardless of the integration approach that you choose for your own practice (if you choose one at all), as therapists it is our ethical duty to never bring up faith in the room unless the client indicates that they are interested.</w:t>
+      </w:r>
+      <w:r>
+        <w:t xml:space="preserve"> </w:t>
+      </w:r>
+      <w:r>
+        <w:rPr>
+          <w:i/>
+          <w:iCs/>
+        </w:rPr>
+        <w:t xml:space="preserve">Critical Issues in Human Services</w:t>
+      </w:r>
+      <w:r>
+        <w:t xml:space="preserve">, a course that we offer in SOCI 400, focuses on this subject. We will discuss this ethical consideration in more detail if you have not taken this course yet. As a Christian therapist or agency, we must respect the autonomy of the client (the ethical principle) and never assume that this is exactly what the client is seeking.</w:t>
+      </w:r>
+    </w:p>
+    <w:p>
+      <w:pPr>
+        <w:pStyle w:val="Heading3"/>
+      </w:pPr>
+      <w:r>
+        <w:t xml:space="preserve">6.2.1 Activity: Read |</w:t>
+      </w:r>
+      <w:r>
+        <w:t xml:space="preserve"> </w:t>
+      </w:r>
+      <w:r>
+        <w:rPr>
+          <w:i/>
+          <w:iCs/>
+        </w:rPr>
+        <w:t xml:space="preserve">Counseling and Christianity: Five Approaches,</w:t>
+      </w:r>
+      <w:r>
+        <w:t xml:space="preserve"> </w:t>
+      </w:r>
+      <w:r>
+        <w:t xml:space="preserve">pp. 60–64, 72–74, and 81</w:t>
+      </w:r>
+    </w:p>
+    <w:p>
+      <w:pPr>
+        <w:pStyle w:val="FirstParagraph"/>
+      </w:pPr>
+      <w:r>
+        <w:rPr>
+          <w:color w:val="6ecfb1"/>
+          <w:sz w:val="24"/>
+          <w:szCs w:val="24"/>
+          <w:b/>
+        </w:rPr>
+        <w:t xml:space="preserve">&lt;Begin learning-activity&gt;</w:t>
+      </w:r>
+    </w:p>
+    <w:p>
+      <w:pPr>
+        <w:pStyle w:val="BodyText"/>
+      </w:pPr>
+      <w:r>
+        <w:rPr>
+          <w:sz w:val="16"/>
+          <w:szCs w:val="16"/>
+          <w:b/>
+        </w:rPr>
+        <w:t xml:space="preserve">Estimated Time</w:t>
+      </w:r>
+      <w:r>
+        <w:rPr>
+          <w:sz w:val="16"/>
+          <w:szCs w:val="16"/>
+          <w:b/>
+        </w:rPr>
+        <w:t xml:space="preserve">: </w:t>
+      </w:r>
+      <w:r>
+        <w:rPr>
+          <w:sz w:val="16"/>
+          <w:szCs w:val="16"/>
+        </w:rPr>
+        <w:t xml:space="preserve"/>
+      </w:r>
+    </w:p>
+    <w:p>
+      <w:pPr>
+        <w:pStyle w:val="BodyText"/>
+      </w:pPr>
+      <w:r>
+        <w:t xml:space="preserve">Please refer to the reading provided for an example of how the levels of explanation view would look in a therapy room. It can be difficult to determine how each of the five approaches will affect the way we work, which is why</w:t>
+      </w:r>
+      <w:r>
+        <w:t xml:space="preserve"> </w:t>
+      </w:r>
+      <w:r>
+        <w:rPr>
+          <w:i/>
+          <w:iCs/>
+        </w:rPr>
+        <w:t xml:space="preserve">Counseling and Christianity: Five Approaches</w:t>
+      </w:r>
+      <w:r>
+        <w:t xml:space="preserve"> </w:t>
+      </w:r>
+      <w:r>
+        <w:t xml:space="preserve">(Johnson, 2012)</w:t>
+      </w:r>
+      <w:r>
+        <w:t xml:space="preserve"> </w:t>
+      </w:r>
+      <w:r>
+        <w:t xml:space="preserve">addresses this issue. By providing these examples, it is hoped that the knowledge will be better integrated into practice.</w:t>
+      </w:r>
+    </w:p>
+    <w:p>
+      <w:pPr>
         <w:pStyle w:val="Compact"/>
         <w:numPr>
           <w:ilvl w:val="0"/>
           <w:numId w:val="1192"/>
         </w:numPr>
       </w:pPr>
-      <w:hyperlink r:id="rId148">
+      <w:hyperlink r:id="rId162">
+        <w:r>
+          <w:rPr>
+            <w:rStyle w:val="Hyperlink"/>
+            <w:i/>
+            <w:iCs/>
+          </w:rPr>
+          <w:t xml:space="preserve">Counseling and Christianity: Five Approaches</w:t>
+        </w:r>
+      </w:hyperlink>
+      <w:r>
+        <w:t xml:space="preserve"> </w:t>
+      </w:r>
+      <w:r>
+        <w:t xml:space="preserve">(2012)</w:t>
+      </w:r>
+    </w:p>
+    <w:p>
+      <w:pPr>
+        <w:pStyle w:val="Compact"/>
+        <w:numPr>
+          <w:ilvl w:val="0"/>
+          <w:numId w:val="1192"/>
+        </w:numPr>
+      </w:pPr>
+      <w:hyperlink r:id="rId149">
         <w:r>
           <w:rPr>
             <w:rStyle w:val="Hyperlink"/>
@@ -22639,7 +22642,7 @@
       <w:pPr>
         <w:pStyle w:val="FirstParagraph"/>
       </w:pPr>
-      <w:hyperlink r:id="rId149">
+      <w:hyperlink r:id="rId150">
         <w:r>
           <w:rPr>
             <w:rStyle w:val="Hyperlink"/>
@@ -22828,7 +22831,7 @@
           <w:numId w:val="1194"/>
         </w:numPr>
       </w:pPr>
-      <w:hyperlink r:id="rId162">
+      <w:hyperlink r:id="rId163">
         <w:r>
           <w:rPr>
             <w:rStyle w:val="Hyperlink"/>
@@ -23028,7 +23031,7 @@
           <w:numId w:val="1196"/>
         </w:numPr>
       </w:pPr>
-      <w:hyperlink r:id="rId162">
+      <w:hyperlink r:id="rId163">
         <w:r>
           <w:rPr>
             <w:rStyle w:val="Hyperlink"/>
@@ -23209,7 +23212,7 @@
           <w:numId w:val="1198"/>
         </w:numPr>
       </w:pPr>
-      <w:hyperlink r:id="rId162">
+      <w:hyperlink r:id="rId163">
         <w:r>
           <w:rPr>
             <w:rStyle w:val="Hyperlink"/>
@@ -23445,7 +23448,7 @@
           <w:numId w:val="1200"/>
         </w:numPr>
       </w:pPr>
-      <w:hyperlink r:id="rId162">
+      <w:hyperlink r:id="rId163">
         <w:r>
           <w:rPr>
             <w:rStyle w:val="Hyperlink"/>
@@ -23637,7 +23640,7 @@
           <w:numId w:val="1202"/>
         </w:numPr>
       </w:pPr>
-      <w:hyperlink r:id="rId162">
+      <w:hyperlink r:id="rId163">
         <w:r>
           <w:rPr>
             <w:rStyle w:val="Hyperlink"/>
@@ -23662,7 +23665,7 @@
           <w:numId w:val="1202"/>
         </w:numPr>
       </w:pPr>
-      <w:hyperlink r:id="rId163">
+      <w:hyperlink r:id="rId164">
         <w:r>
           <w:rPr>
             <w:rStyle w:val="Hyperlink"/>
@@ -24771,7 +24774,7 @@
           <w:numId w:val="1212"/>
         </w:numPr>
       </w:pPr>
-      <w:hyperlink r:id="rId164">
+      <w:hyperlink r:id="rId165">
         <w:r>
           <w:rPr>
             <w:rStyle w:val="Hyperlink"/>
@@ -24788,7 +24791,7 @@
           <w:numId w:val="1212"/>
         </w:numPr>
       </w:pPr>
-      <w:hyperlink r:id="rId165">
+      <w:hyperlink r:id="rId166">
         <w:r>
           <w:rPr>
             <w:rStyle w:val="Hyperlink"/>
@@ -25529,8 +25532,8 @@
         <w:t xml:space="preserve">(Johnson, 2010, p. 49)</w:t>
       </w:r>
     </w:p>
-    <w:bookmarkStart w:id="263" w:name="refs"/>
-    <w:bookmarkStart w:id="166" w:name="ref-abcnewsSuicideClusterPalo2016"/>
+    <w:bookmarkStart w:id="264" w:name="refs"/>
+    <w:bookmarkStart w:id="167" w:name="ref-abcnewsSuicideClusterPalo2016"/>
     <w:p>
       <w:pPr>
         <w:pStyle w:val="Bibliography"/>
@@ -25601,8 +25604,8 @@
         <w:t xml:space="preserve">. YouTube.</w:t>
       </w:r>
     </w:p>
-    <w:bookmarkEnd w:id="166"/>
-    <w:bookmarkStart w:id="167" w:name="ref-amenclinicsDrugsAlcoholAddiction"/>
+    <w:bookmarkEnd w:id="167"/>
+    <w:bookmarkStart w:id="168" w:name="ref-amenclinicsDrugsAlcoholAddiction"/>
     <w:p>
       <w:pPr>
         <w:pStyle w:val="Bibliography"/>
@@ -25624,8 +25627,8 @@
         <w:t xml:space="preserve">. https://www.amenclinics.com/conditions/drugs-and-alcohol-addiction/.</w:t>
       </w:r>
     </w:p>
-    <w:bookmarkEnd w:id="167"/>
-    <w:bookmarkStart w:id="168" w:name="X5936e77050a85820bd4221dc99790d99f0f0083"/>
+    <w:bookmarkEnd w:id="168"/>
+    <w:bookmarkStart w:id="169" w:name="X5936e77050a85820bd4221dc99790d99f0f0083"/>
     <w:p>
       <w:pPr>
         <w:pStyle w:val="Bibliography"/>
@@ -25682,8 +25685,8 @@
         <w:t xml:space="preserve">. YouTube.</w:t>
       </w:r>
     </w:p>
-    <w:bookmarkEnd w:id="168"/>
-    <w:bookmarkStart w:id="169" w:name="Xde93ab615aefc7e3350419ddfdb521b1db7064a"/>
+    <w:bookmarkEnd w:id="169"/>
+    <w:bookmarkStart w:id="170" w:name="Xde93ab615aefc7e3350419ddfdb521b1db7064a"/>
     <w:p>
       <w:pPr>
         <w:pStyle w:val="Bibliography"/>
@@ -25711,8 +25714,8 @@
         <w:t xml:space="preserve">. https://www.apa.org/ptsd-guideline/treatments/narrative-exposure-therapy.</w:t>
       </w:r>
     </w:p>
-    <w:bookmarkEnd w:id="169"/>
-    <w:bookmarkStart w:id="170" w:name="ref-arcframeworkWhatARC"/>
+    <w:bookmarkEnd w:id="170"/>
+    <w:bookmarkStart w:id="171" w:name="ref-arcframeworkWhatARC"/>
     <w:p>
       <w:pPr>
         <w:pStyle w:val="Bibliography"/>
@@ -25755,8 +25758,8 @@
         <w:t xml:space="preserve"> https://arcframework.org/what-is-arc/.</w:t>
       </w:r>
     </w:p>
-    <w:bookmarkEnd w:id="170"/>
-    <w:bookmarkStart w:id="171" w:name="ref-bbcideasDyingNotBad2019"/>
+    <w:bookmarkEnd w:id="171"/>
+    <w:bookmarkStart w:id="172" w:name="ref-bbcideasDyingNotBad2019"/>
     <w:p>
       <w:pPr>
         <w:pStyle w:val="Bibliography"/>
@@ -25799,8 +25802,8 @@
         <w:t xml:space="preserve">. YouTube.</w:t>
       </w:r>
     </w:p>
-    <w:bookmarkEnd w:id="171"/>
-    <w:bookmarkStart w:id="172" w:name="ref-bigthinkWhatTraumaAuthor2021"/>
+    <w:bookmarkEnd w:id="172"/>
+    <w:bookmarkStart w:id="173" w:name="ref-bigthinkWhatTraumaAuthor2021"/>
     <w:p>
       <w:pPr>
         <w:pStyle w:val="Bibliography"/>
@@ -25899,8 +25902,8 @@
         <w:t xml:space="preserve">. YouTube.</w:t>
       </w:r>
     </w:p>
-    <w:bookmarkEnd w:id="172"/>
-    <w:bookmarkStart w:id="173" w:name="X2ef632609e2ee802570c3555e345950776ebaf3"/>
+    <w:bookmarkEnd w:id="173"/>
+    <w:bookmarkStart w:id="174" w:name="X2ef632609e2ee802570c3555e345950776ebaf3"/>
     <w:p>
       <w:pPr>
         <w:pStyle w:val="Bibliography"/>
@@ -25985,8 +25988,8 @@
         <w:t xml:space="preserve">. YouTube.</w:t>
       </w:r>
     </w:p>
-    <w:bookmarkEnd w:id="173"/>
-    <w:bookmarkStart w:id="175" w:name="ref-brauschRoleBodyImage2009"/>
+    <w:bookmarkEnd w:id="174"/>
+    <w:bookmarkStart w:id="176" w:name="ref-brauschRoleBodyImage2009"/>
     <w:p>
       <w:pPr>
         <w:pStyle w:val="Bibliography"/>
@@ -26023,7 +26026,7 @@
       <w:r>
         <w:t xml:space="preserve"> </w:t>
       </w:r>
-      <w:hyperlink r:id="rId174">
+      <w:hyperlink r:id="rId175">
         <w:r>
           <w:rPr>
             <w:rStyle w:val="Hyperlink"/>
@@ -26032,8 +26035,8 @@
         </w:r>
       </w:hyperlink>
     </w:p>
-    <w:bookmarkEnd w:id="175"/>
-    <w:bookmarkStart w:id="176" w:name="ref-breakfastalienMySuicideShneidman2014"/>
+    <w:bookmarkEnd w:id="176"/>
+    <w:bookmarkStart w:id="177" w:name="ref-breakfastalienMySuicideShneidman2014"/>
     <w:p>
       <w:pPr>
         <w:pStyle w:val="Bibliography"/>
@@ -26097,8 +26100,8 @@
         <w:t xml:space="preserve">. YouTube.</w:t>
       </w:r>
     </w:p>
-    <w:bookmarkEnd w:id="176"/>
-    <w:bookmarkStart w:id="177" w:name="ref-brownPowerVulnerability2010"/>
+    <w:bookmarkEnd w:id="177"/>
+    <w:bookmarkStart w:id="178" w:name="ref-brownPowerVulnerability2010"/>
     <w:p>
       <w:pPr>
         <w:pStyle w:val="Bibliography"/>
@@ -26120,8 +26123,8 @@
         <w:t xml:space="preserve">. TED.</w:t>
       </w:r>
     </w:p>
-    <w:bookmarkEnd w:id="177"/>
-    <w:bookmarkStart w:id="178" w:name="ref-brownAtlasHeartMapping2021"/>
+    <w:bookmarkEnd w:id="178"/>
+    <w:bookmarkStart w:id="179" w:name="ref-brownAtlasHeartMapping2021"/>
     <w:p>
       <w:pPr>
         <w:pStyle w:val="Bibliography"/>
@@ -26171,8 +26174,8 @@
         <w:t xml:space="preserve">. Random House.</w:t>
       </w:r>
     </w:p>
-    <w:bookmarkEnd w:id="178"/>
-    <w:bookmarkStart w:id="180" w:name="ref-brunLastWordEnding2021"/>
+    <w:bookmarkEnd w:id="179"/>
+    <w:bookmarkStart w:id="181" w:name="ref-brunLastWordEnding2021"/>
     <w:p>
       <w:pPr>
         <w:pStyle w:val="Bibliography"/>
@@ -26209,7 +26212,7 @@
       <w:r>
         <w:t xml:space="preserve"> </w:t>
       </w:r>
-      <w:hyperlink r:id="rId179">
+      <w:hyperlink r:id="rId180">
         <w:r>
           <w:rPr>
             <w:rStyle w:val="Hyperlink"/>
@@ -26218,8 +26221,8 @@
         </w:r>
       </w:hyperlink>
     </w:p>
-    <w:bookmarkEnd w:id="180"/>
-    <w:bookmarkStart w:id="181" w:name="ref-burkeharrisHowChildhoodTrauma2015"/>
+    <w:bookmarkEnd w:id="181"/>
+    <w:bookmarkStart w:id="182" w:name="ref-burkeharrisHowChildhoodTrauma2015"/>
     <w:p>
       <w:pPr>
         <w:pStyle w:val="Bibliography"/>
@@ -26241,8 +26244,8 @@
         <w:t xml:space="preserve">. YouTube.</w:t>
       </w:r>
     </w:p>
-    <w:bookmarkEnd w:id="181"/>
-    <w:bookmarkStart w:id="182" w:name="ref-CanadaStress"/>
+    <w:bookmarkEnd w:id="182"/>
+    <w:bookmarkStart w:id="183" w:name="ref-CanadaStress"/>
     <w:p>
       <w:pPr>
         <w:pStyle w:val="Bibliography"/>
@@ -26272,8 +26275,8 @@
         <w:t xml:space="preserve">. (n.d.). https://stresscanada.org/.</w:t>
       </w:r>
     </w:p>
-    <w:bookmarkEnd w:id="182"/>
-    <w:bookmarkStart w:id="183" w:name="ref-ccefHowBiblicalCounseling2011"/>
+    <w:bookmarkEnd w:id="183"/>
+    <w:bookmarkStart w:id="184" w:name="ref-ccefHowBiblicalCounseling2011"/>
     <w:p>
       <w:pPr>
         <w:pStyle w:val="Bibliography"/>
@@ -26365,8 +26368,8 @@
         <w:t xml:space="preserve">. YouTube.</w:t>
       </w:r>
     </w:p>
-    <w:bookmarkEnd w:id="183"/>
-    <w:bookmarkStart w:id="184" w:name="X17eca3241010601a9a6b347cd9eaba31a3833cd"/>
+    <w:bookmarkEnd w:id="184"/>
+    <w:bookmarkStart w:id="185" w:name="X17eca3241010601a9a6b347cd9eaba31a3833cd"/>
     <w:p>
       <w:pPr>
         <w:pStyle w:val="Bibliography"/>
@@ -26423,8 +26426,8 @@
         <w:t xml:space="preserve">. YouTube.</w:t>
       </w:r>
     </w:p>
-    <w:bookmarkEnd w:id="184"/>
-    <w:bookmarkStart w:id="185" w:name="Xb6ce29d59ba0420bd9bea38f2222652da10f955"/>
+    <w:bookmarkEnd w:id="185"/>
+    <w:bookmarkStart w:id="186" w:name="Xb6ce29d59ba0420bd9bea38f2222652da10f955"/>
     <w:p>
       <w:pPr>
         <w:pStyle w:val="Bibliography"/>
@@ -26502,8 +26505,8 @@
         <w:t xml:space="preserve">. YouTube.</w:t>
       </w:r>
     </w:p>
-    <w:bookmarkEnd w:id="185"/>
-    <w:bookmarkStart w:id="186" w:name="ref-chenStressManagementPrevention2011"/>
+    <w:bookmarkEnd w:id="186"/>
+    <w:bookmarkStart w:id="187" w:name="ref-chenStressManagementPrevention2011"/>
     <w:p>
       <w:pPr>
         <w:pStyle w:val="Bibliography"/>
@@ -26556,8 +26559,8 @@
         <w:t xml:space="preserve">(2nd ed.). Routledge.</w:t>
       </w:r>
     </w:p>
-    <w:bookmarkEnd w:id="186"/>
-    <w:bookmarkStart w:id="188" w:name="X4a83ef953a63eca6fedded7869b539fd05347a5"/>
+    <w:bookmarkEnd w:id="187"/>
+    <w:bookmarkStart w:id="189" w:name="X4a83ef953a63eca6fedded7869b539fd05347a5"/>
     <w:p>
       <w:pPr>
         <w:pStyle w:val="Bibliography"/>
@@ -26594,7 +26597,7 @@
       <w:r>
         <w:t xml:space="preserve"> </w:t>
       </w:r>
-      <w:hyperlink r:id="rId187">
+      <w:hyperlink r:id="rId188">
         <w:r>
           <w:rPr>
             <w:rStyle w:val="Hyperlink"/>
@@ -26603,8 +26606,8 @@
         </w:r>
       </w:hyperlink>
     </w:p>
-    <w:bookmarkEnd w:id="188"/>
-    <w:bookmarkStart w:id="189" w:name="X5e6a2ec79741d3804c5965eeffaa36f9ebce69c"/>
+    <w:bookmarkEnd w:id="189"/>
+    <w:bookmarkStart w:id="190" w:name="X5e6a2ec79741d3804c5965eeffaa36f9ebce69c"/>
     <w:p>
       <w:pPr>
         <w:pStyle w:val="Bibliography"/>
@@ -26675,8 +26678,8 @@
         <w:t xml:space="preserve">. YouTube.</w:t>
       </w:r>
     </w:p>
-    <w:bookmarkEnd w:id="189"/>
-    <w:bookmarkStart w:id="190" w:name="Xd537274801f656992115a93fd976e6a0f379093"/>
+    <w:bookmarkEnd w:id="190"/>
+    <w:bookmarkStart w:id="191" w:name="Xd537274801f656992115a93fd976e6a0f379093"/>
     <w:p>
       <w:pPr>
         <w:pStyle w:val="Bibliography"/>
@@ -26754,8 +26757,8 @@
         <w:t xml:space="preserve">. YouTube.</w:t>
       </w:r>
     </w:p>
-    <w:bookmarkEnd w:id="190"/>
-    <w:bookmarkStart w:id="191" w:name="X2896a1852fe39ced64f3297a97a24f228467ea5"/>
+    <w:bookmarkEnd w:id="191"/>
+    <w:bookmarkStart w:id="192" w:name="X2896a1852fe39ced64f3297a97a24f228467ea5"/>
     <w:p>
       <w:pPr>
         <w:pStyle w:val="Bibliography"/>
@@ -26833,8 +26836,8 @@
         <w:t xml:space="preserve">. YouTube.</w:t>
       </w:r>
     </w:p>
-    <w:bookmarkEnd w:id="191"/>
-    <w:bookmarkStart w:id="192" w:name="X7dbb5b54de31391c69b3e723a2117af0fd64dd5"/>
+    <w:bookmarkEnd w:id="192"/>
+    <w:bookmarkStart w:id="193" w:name="X7dbb5b54de31391c69b3e723a2117af0fd64dd5"/>
     <w:p>
       <w:pPr>
         <w:pStyle w:val="Bibliography"/>
@@ -26912,8 +26915,8 @@
         <w:t xml:space="preserve">. YouTube.</w:t>
       </w:r>
     </w:p>
-    <w:bookmarkEnd w:id="192"/>
-    <w:bookmarkStart w:id="193" w:name="Xe54e7ab143312822898ded0b2bf11ead6ae4ea5"/>
+    <w:bookmarkEnd w:id="193"/>
+    <w:bookmarkStart w:id="194" w:name="Xe54e7ab143312822898ded0b2bf11ead6ae4ea5"/>
     <w:p>
       <w:pPr>
         <w:pStyle w:val="Bibliography"/>
@@ -26977,8 +26980,8 @@
         <w:t xml:space="preserve">. YouTube.</w:t>
       </w:r>
     </w:p>
-    <w:bookmarkEnd w:id="193"/>
-    <w:bookmarkStart w:id="194" w:name="ref-ComplexTraumaTreatments"/>
+    <w:bookmarkEnd w:id="194"/>
+    <w:bookmarkStart w:id="195" w:name="ref-ComplexTraumaTreatments"/>
     <w:p>
       <w:pPr>
         <w:pStyle w:val="Bibliography"/>
@@ -27000,8 +27003,8 @@
         <w:t xml:space="preserve">. https://www.complextrauma.org/treatment/complex-trauma-treatments-for-adults/.</w:t>
       </w:r>
     </w:p>
-    <w:bookmarkEnd w:id="194"/>
-    <w:bookmarkStart w:id="195" w:name="ref-counsellingtutorFiveStagesGrief2012"/>
+    <w:bookmarkEnd w:id="195"/>
+    <w:bookmarkStart w:id="196" w:name="ref-counsellingtutorFiveStagesGrief2012"/>
     <w:p>
       <w:pPr>
         <w:pStyle w:val="Bibliography"/>
@@ -27037,8 +27040,8 @@
         <w:t xml:space="preserve">. YouTube.</w:t>
       </w:r>
     </w:p>
-    <w:bookmarkEnd w:id="195"/>
-    <w:bookmarkStart w:id="197" w:name="ref-courtoisComplexTraumaComplex2004"/>
+    <w:bookmarkEnd w:id="196"/>
+    <w:bookmarkStart w:id="198" w:name="ref-courtoisComplexTraumaComplex2004"/>
     <w:p>
       <w:pPr>
         <w:pStyle w:val="Bibliography"/>
@@ -27087,7 +27090,7 @@
       <w:r>
         <w:t xml:space="preserve"> </w:t>
       </w:r>
-      <w:hyperlink r:id="rId196">
+      <w:hyperlink r:id="rId197">
         <w:r>
           <w:rPr>
             <w:rStyle w:val="Hyperlink"/>
@@ -27096,8 +27099,8 @@
         </w:r>
       </w:hyperlink>
     </w:p>
-    <w:bookmarkEnd w:id="197"/>
-    <w:bookmarkStart w:id="198" w:name="Xc002c739a36da123200303c36760ab76c5faa71"/>
+    <w:bookmarkEnd w:id="198"/>
+    <w:bookmarkStart w:id="199" w:name="Xc002c739a36da123200303c36760ab76c5faa71"/>
     <w:p>
       <w:pPr>
         <w:pStyle w:val="Bibliography"/>
@@ -27175,8 +27178,8 @@
         <w:t xml:space="preserve">.</w:t>
       </w:r>
     </w:p>
-    <w:bookmarkEnd w:id="198"/>
-    <w:bookmarkStart w:id="199" w:name="Xfd76ac4e1c3c1d758ebd9723f490eb5530b35a9"/>
+    <w:bookmarkEnd w:id="199"/>
+    <w:bookmarkStart w:id="200" w:name="Xfd76ac4e1c3c1d758ebd9723f490eb5530b35a9"/>
     <w:p>
       <w:pPr>
         <w:pStyle w:val="Bibliography"/>
@@ -27282,8 +27285,8 @@
         <w:t xml:space="preserve">. YouTube.</w:t>
       </w:r>
     </w:p>
-    <w:bookmarkEnd w:id="199"/>
-    <w:bookmarkStart w:id="200" w:name="ref-ElisabethKublerRossFoundation"/>
+    <w:bookmarkEnd w:id="200"/>
+    <w:bookmarkStart w:id="201" w:name="ref-ElisabethKublerRossFoundation"/>
     <w:p>
       <w:pPr>
         <w:pStyle w:val="Bibliography"/>
@@ -27313,8 +27316,8 @@
         <w:t xml:space="preserve">. (n.d.). https://www.ekrfoundation.org/.</w:t>
       </w:r>
     </w:p>
-    <w:bookmarkEnd w:id="200"/>
-    <w:bookmarkStart w:id="201" w:name="ref-ementalhealthMentalHealthResources"/>
+    <w:bookmarkEnd w:id="201"/>
+    <w:bookmarkStart w:id="202" w:name="ref-ementalhealthMentalHealthResources"/>
     <w:p>
       <w:pPr>
         <w:pStyle w:val="Bibliography"/>
@@ -27336,8 +27339,8 @@
         <w:t xml:space="preserve">. https://www.ementalhealth.ca/.</w:t>
       </w:r>
     </w:p>
-    <w:bookmarkEnd w:id="201"/>
-    <w:bookmarkStart w:id="202" w:name="X69d789e254306d9ab15af2e4a1203df6967e17c"/>
+    <w:bookmarkEnd w:id="202"/>
+    <w:bookmarkStart w:id="203" w:name="X69d789e254306d9ab15af2e4a1203df6967e17c"/>
     <w:p>
       <w:pPr>
         <w:pStyle w:val="Bibliography"/>
@@ -27372,8 +27375,8 @@
         <w:t xml:space="preserve">(Suppl), 72–78.</w:t>
       </w:r>
     </w:p>
-    <w:bookmarkEnd w:id="202"/>
-    <w:bookmarkStart w:id="203" w:name="ref-filmbilder&amp;friendsNuggets2014"/>
+    <w:bookmarkEnd w:id="203"/>
+    <w:bookmarkStart w:id="204" w:name="ref-filmbilder&amp;friendsNuggets2014"/>
     <w:p>
       <w:pPr>
         <w:pStyle w:val="Bibliography"/>
@@ -27395,8 +27398,8 @@
         <w:t xml:space="preserve">. YouTube.</w:t>
       </w:r>
     </w:p>
-    <w:bookmarkEnd w:id="203"/>
-    <w:bookmarkStart w:id="204" w:name="ref-foundryYouMatter"/>
+    <w:bookmarkEnd w:id="204"/>
+    <w:bookmarkStart w:id="205" w:name="ref-foundryYouMatter"/>
     <w:p>
       <w:pPr>
         <w:pStyle w:val="Bibliography"/>
@@ -27418,8 +27421,8 @@
         <w:t xml:space="preserve">. https://foundrybc.ca/youmatter/.</w:t>
       </w:r>
     </w:p>
-    <w:bookmarkEnd w:id="204"/>
-    <w:bookmarkStart w:id="205" w:name="ref-ftmyersfampsychDrDanielSiegel2012"/>
+    <w:bookmarkEnd w:id="205"/>
+    <w:bookmarkStart w:id="206" w:name="ref-ftmyersfampsychDrDanielSiegel2012"/>
     <w:p>
       <w:pPr>
         <w:pStyle w:val="Bibliography"/>
@@ -27469,8 +27472,8 @@
         <w:t xml:space="preserve">. YouTube.</w:t>
       </w:r>
     </w:p>
-    <w:bookmarkEnd w:id="205"/>
-    <w:bookmarkStart w:id="206" w:name="Xc452839e9cbfa946c3746a75f959f2d7427bbee"/>
+    <w:bookmarkEnd w:id="206"/>
+    <w:bookmarkStart w:id="207" w:name="Xc452839e9cbfa946c3746a75f959f2d7427bbee"/>
     <w:p>
       <w:pPr>
         <w:pStyle w:val="Bibliography"/>
@@ -27520,8 +27523,8 @@
         <w:t xml:space="preserve">. YouTube.</w:t>
       </w:r>
     </w:p>
-    <w:bookmarkEnd w:id="206"/>
-    <w:bookmarkStart w:id="207" w:name="ref-gawandeBeingMortalMedicine2017"/>
+    <w:bookmarkEnd w:id="207"/>
+    <w:bookmarkStart w:id="208" w:name="ref-gawandeBeingMortalMedicine2017"/>
     <w:p>
       <w:pPr>
         <w:pStyle w:val="Bibliography"/>
@@ -27571,8 +27574,8 @@
         <w:t xml:space="preserve">. Anchor Canada.</w:t>
       </w:r>
     </w:p>
-    <w:bookmarkEnd w:id="207"/>
-    <w:bookmarkStart w:id="208" w:name="ref-Glossary"/>
+    <w:bookmarkEnd w:id="208"/>
+    <w:bookmarkStart w:id="209" w:name="ref-Glossary"/>
     <w:p>
       <w:pPr>
         <w:pStyle w:val="Bibliography"/>
@@ -27594,8 +27597,8 @@
         <w:t xml:space="preserve">. https://www.complextrauma.org/glossary/.</w:t>
       </w:r>
     </w:p>
-    <w:bookmarkEnd w:id="208"/>
-    <w:bookmarkStart w:id="210" w:name="ref-goldGeneratingVocabularyMourning2020"/>
+    <w:bookmarkEnd w:id="209"/>
+    <w:bookmarkStart w:id="211" w:name="ref-goldGeneratingVocabularyMourning2020"/>
     <w:p>
       <w:pPr>
         <w:pStyle w:val="Bibliography"/>
@@ -27644,7 +27647,7 @@
       <w:r>
         <w:t xml:space="preserve"> </w:t>
       </w:r>
-      <w:hyperlink r:id="rId209">
+      <w:hyperlink r:id="rId210">
         <w:r>
           <w:rPr>
             <w:rStyle w:val="Hyperlink"/>
@@ -27653,8 +27656,8 @@
         </w:r>
       </w:hyperlink>
     </w:p>
-    <w:bookmarkEnd w:id="210"/>
-    <w:bookmarkStart w:id="211" w:name="X20f7b7bded6878255c0584573223fa8eb675d00"/>
+    <w:bookmarkEnd w:id="211"/>
+    <w:bookmarkStart w:id="212" w:name="X20f7b7bded6878255c0584573223fa8eb675d00"/>
     <w:p>
       <w:pPr>
         <w:pStyle w:val="Bibliography"/>
@@ -27683,8 +27686,8 @@
         <w:t xml:space="preserve">.</w:t>
       </w:r>
     </w:p>
-    <w:bookmarkEnd w:id="211"/>
-    <w:bookmarkStart w:id="212" w:name="ref-haguetalksBuildingResilienceCare2019"/>
+    <w:bookmarkEnd w:id="212"/>
+    <w:bookmarkStart w:id="213" w:name="ref-haguetalksBuildingResilienceCare2019"/>
     <w:p>
       <w:pPr>
         <w:pStyle w:val="Bibliography"/>
@@ -27741,8 +27744,8 @@
         <w:t xml:space="preserve">. YouTube.</w:t>
       </w:r>
     </w:p>
-    <w:bookmarkEnd w:id="212"/>
-    <w:bookmarkStart w:id="214" w:name="ref-hawSuicideClustersReview2013"/>
+    <w:bookmarkEnd w:id="213"/>
+    <w:bookmarkStart w:id="215" w:name="ref-hawSuicideClustersReview2013"/>
     <w:p>
       <w:pPr>
         <w:pStyle w:val="Bibliography"/>
@@ -27791,7 +27794,7 @@
       <w:r>
         <w:t xml:space="preserve"> </w:t>
       </w:r>
-      <w:hyperlink r:id="rId213">
+      <w:hyperlink r:id="rId214">
         <w:r>
           <w:rPr>
             <w:rStyle w:val="Hyperlink"/>
@@ -27800,8 +27803,8 @@
         </w:r>
       </w:hyperlink>
     </w:p>
-    <w:bookmarkEnd w:id="214"/>
-    <w:bookmarkStart w:id="215" w:name="ref-healthlineHowCanGet"/>
+    <w:bookmarkEnd w:id="215"/>
+    <w:bookmarkStart w:id="216" w:name="ref-healthlineHowCanGet"/>
     <w:p>
       <w:pPr>
         <w:pStyle w:val="Bibliography"/>
@@ -27851,8 +27854,8 @@
         <w:t xml:space="preserve">. https://www.healthline.com/health/depression/help-for-depression.</w:t>
       </w:r>
     </w:p>
-    <w:bookmarkEnd w:id="215"/>
-    <w:bookmarkStart w:id="216" w:name="ref-hopperTreatingAdultSurvivors2021"/>
+    <w:bookmarkEnd w:id="216"/>
+    <w:bookmarkStart w:id="217" w:name="ref-hopperTreatingAdultSurvivors2021"/>
     <w:p>
       <w:pPr>
         <w:pStyle w:val="Bibliography"/>
@@ -27902,8 +27905,8 @@
         <w:t xml:space="preserve">. Guilford Press.</w:t>
       </w:r>
     </w:p>
-    <w:bookmarkEnd w:id="216"/>
-    <w:bookmarkStart w:id="217" w:name="ref-howtoacademyDrGaborMate2019"/>
+    <w:bookmarkEnd w:id="217"/>
+    <w:bookmarkStart w:id="218" w:name="ref-howtoacademyDrGaborMate2019"/>
     <w:p>
       <w:pPr>
         <w:pStyle w:val="Bibliography"/>
@@ -27953,8 +27956,8 @@
         <w:t xml:space="preserve">. YouTube.</w:t>
       </w:r>
     </w:p>
-    <w:bookmarkEnd w:id="217"/>
-    <w:bookmarkStart w:id="218" w:name="X942ba57e8701e292b87828ba22e2cc14d026297"/>
+    <w:bookmarkEnd w:id="218"/>
+    <w:bookmarkStart w:id="219" w:name="X942ba57e8701e292b87828ba22e2cc14d026297"/>
     <w:p>
       <w:pPr>
         <w:pStyle w:val="Bibliography"/>
@@ -28025,8 +28028,8 @@
         <w:t xml:space="preserve">. YouTube.</w:t>
       </w:r>
     </w:p>
-    <w:bookmarkEnd w:id="218"/>
-    <w:bookmarkStart w:id="220" w:name="X3d3757bb4f752dfb2f33e0c38c8141dabd2455f"/>
+    <w:bookmarkEnd w:id="219"/>
+    <w:bookmarkStart w:id="221" w:name="X3d3757bb4f752dfb2f33e0c38c8141dabd2455f"/>
     <w:p>
       <w:pPr>
         <w:pStyle w:val="Bibliography"/>
@@ -28074,7 +28077,7 @@
       <w:r>
         <w:t xml:space="preserve"> </w:t>
       </w:r>
-      <w:hyperlink r:id="rId219">
+      <w:hyperlink r:id="rId220">
         <w:r>
           <w:rPr>
             <w:rStyle w:val="Hyperlink"/>
@@ -28083,8 +28086,8 @@
         </w:r>
       </w:hyperlink>
     </w:p>
-    <w:bookmarkEnd w:id="220"/>
-    <w:bookmarkStart w:id="221" w:name="ref-johannhariEverythingYouThink2015"/>
+    <w:bookmarkEnd w:id="221"/>
+    <w:bookmarkStart w:id="222" w:name="ref-johannhariEverythingYouThink2015"/>
     <w:p>
       <w:pPr>
         <w:pStyle w:val="Bibliography"/>
@@ -28106,8 +28109,8 @@
         <w:t xml:space="preserve">. YouTube.</w:t>
       </w:r>
     </w:p>
-    <w:bookmarkEnd w:id="221"/>
-    <w:bookmarkStart w:id="222" w:name="ref-johnsonPsychologyChristianity2010"/>
+    <w:bookmarkEnd w:id="222"/>
+    <w:bookmarkStart w:id="223" w:name="ref-johnsonPsychologyChristianity2010"/>
     <w:p>
       <w:pPr>
         <w:pStyle w:val="Bibliography"/>
@@ -28143,8 +28146,8 @@
         <w:t xml:space="preserve">. IVP Academic.</w:t>
       </w:r>
     </w:p>
-    <w:bookmarkEnd w:id="222"/>
-    <w:bookmarkStart w:id="223" w:name="X56b2626cb1375397ad0efe28fc450f51ff6d5b7"/>
+    <w:bookmarkEnd w:id="223"/>
+    <w:bookmarkStart w:id="224" w:name="X56b2626cb1375397ad0efe28fc450f51ff6d5b7"/>
     <w:p>
       <w:pPr>
         <w:pStyle w:val="Bibliography"/>
@@ -28218,8 +28221,8 @@
         <w:t xml:space="preserve">(S. P. Greggo &amp; T. A. Sisemore, Eds.). IVP Academic.</w:t>
       </w:r>
     </w:p>
-    <w:bookmarkEnd w:id="223"/>
-    <w:bookmarkStart w:id="224" w:name="ref-kellerWalkingGodPain2013"/>
+    <w:bookmarkEnd w:id="224"/>
+    <w:bookmarkStart w:id="225" w:name="ref-kellerWalkingGodPain2013"/>
     <w:p>
       <w:pPr>
         <w:pStyle w:val="Bibliography"/>
@@ -28241,8 +28244,8 @@
         <w:t xml:space="preserve">. Penguin Books.</w:t>
       </w:r>
     </w:p>
-    <w:bookmarkEnd w:id="224"/>
-    <w:bookmarkStart w:id="225" w:name="ref-kubler-rossDeathDying1970"/>
+    <w:bookmarkEnd w:id="225"/>
+    <w:bookmarkStart w:id="226" w:name="ref-kubler-rossDeathDying1970"/>
     <w:p>
       <w:pPr>
         <w:pStyle w:val="Bibliography"/>
@@ -28306,8 +28309,8 @@
         <w:t xml:space="preserve">. Scribner.</w:t>
       </w:r>
     </w:p>
-    <w:bookmarkEnd w:id="225"/>
-    <w:bookmarkStart w:id="227" w:name="Xa545be35e8f1985202e30823ab1e0cf0f02a66b"/>
+    <w:bookmarkEnd w:id="226"/>
+    <w:bookmarkStart w:id="228" w:name="Xa545be35e8f1985202e30823ab1e0cf0f02a66b"/>
     <w:p>
       <w:pPr>
         <w:pStyle w:val="Bibliography"/>
@@ -28362,7 +28365,7 @@
       <w:r>
         <w:t xml:space="preserve"> </w:t>
       </w:r>
-      <w:hyperlink r:id="rId226">
+      <w:hyperlink r:id="rId227">
         <w:r>
           <w:rPr>
             <w:rStyle w:val="Hyperlink"/>
@@ -28371,8 +28374,8 @@
         </w:r>
       </w:hyperlink>
     </w:p>
-    <w:bookmarkEnd w:id="227"/>
-    <w:bookmarkStart w:id="228" w:name="X04bfa9c8a76da6becf6424d5ee7bc8cb8b7e194"/>
+    <w:bookmarkEnd w:id="228"/>
+    <w:bookmarkStart w:id="229" w:name="X04bfa9c8a76da6becf6424d5ee7bc8cb8b7e194"/>
     <w:p>
       <w:pPr>
         <w:pStyle w:val="Bibliography"/>
@@ -28422,8 +28425,8 @@
         <w:t xml:space="preserve"> YouTube.</w:t>
       </w:r>
     </w:p>
-    <w:bookmarkEnd w:id="228"/>
-    <w:bookmarkStart w:id="229" w:name="ref-linesforlifeServicesCrisisLines"/>
+    <w:bookmarkEnd w:id="229"/>
+    <w:bookmarkStart w:id="230" w:name="ref-linesforlifeServicesCrisisLines"/>
     <w:p>
       <w:pPr>
         <w:pStyle w:val="Bibliography"/>
@@ -28445,8 +28448,8 @@
         <w:t xml:space="preserve">. https://www.linesforlife.org/get-help-now/services-and-crisis-lines/.</w:t>
       </w:r>
     </w:p>
-    <w:bookmarkEnd w:id="229"/>
-    <w:bookmarkStart w:id="230" w:name="X118eadeffa9bc6d02fcbde3ded9818f97a5b3ac"/>
+    <w:bookmarkEnd w:id="230"/>
+    <w:bookmarkStart w:id="231" w:name="X118eadeffa9bc6d02fcbde3ded9818f97a5b3ac"/>
     <w:p>
       <w:pPr>
         <w:pStyle w:val="Bibliography"/>
@@ -28468,8 +28471,8 @@
         <w:t xml:space="preserve">. https://www.neufeldinstitute.org/editorials/resilience-embracing-the-emotional-journey.</w:t>
       </w:r>
     </w:p>
-    <w:bookmarkEnd w:id="230"/>
-    <w:bookmarkStart w:id="231" w:name="ref-mastenOrdinaryMagicResilience2014"/>
+    <w:bookmarkEnd w:id="231"/>
+    <w:bookmarkStart w:id="232" w:name="ref-mastenOrdinaryMagicResilience2014"/>
     <w:p>
       <w:pPr>
         <w:pStyle w:val="Bibliography"/>
@@ -28519,8 +28522,8 @@
         <w:t xml:space="preserve">. Guilford Press.</w:t>
       </w:r>
     </w:p>
-    <w:bookmarkEnd w:id="231"/>
-    <w:bookmarkStart w:id="232" w:name="ref-mateRealmHungryGhosts2010"/>
+    <w:bookmarkEnd w:id="232"/>
+    <w:bookmarkStart w:id="233" w:name="ref-mateRealmHungryGhosts2010"/>
     <w:p>
       <w:pPr>
         <w:pStyle w:val="Bibliography"/>
@@ -28570,8 +28573,8 @@
         <w:t xml:space="preserve">. North Atlantic Books.</w:t>
       </w:r>
     </w:p>
-    <w:bookmarkEnd w:id="232"/>
-    <w:bookmarkStart w:id="233" w:name="X8137e79481a83ba62fa4c2ab2079e06b1cadf91"/>
+    <w:bookmarkEnd w:id="233"/>
+    <w:bookmarkStart w:id="234" w:name="X8137e79481a83ba62fa4c2ab2079e06b1cadf91"/>
     <w:p>
       <w:pPr>
         <w:pStyle w:val="Bibliography"/>
@@ -28593,8 +28596,8 @@
         <w:t xml:space="preserve">. https://nedic.ca/.</w:t>
       </w:r>
     </w:p>
-    <w:bookmarkEnd w:id="233"/>
-    <w:bookmarkStart w:id="234" w:name="X4ec457ff2537c170003e97a919ac2451610c8f7"/>
+    <w:bookmarkEnd w:id="234"/>
+    <w:bookmarkStart w:id="235" w:name="X4ec457ff2537c170003e97a919ac2451610c8f7"/>
     <w:p>
       <w:pPr>
         <w:pStyle w:val="Bibliography"/>
@@ -28651,8 +28654,8 @@
         <w:t xml:space="preserve">. YouTube.</w:t>
       </w:r>
     </w:p>
-    <w:bookmarkEnd w:id="234"/>
-    <w:bookmarkStart w:id="235" w:name="ref-nicabmBesselVanKolk2013"/>
+    <w:bookmarkEnd w:id="235"/>
+    <w:bookmarkStart w:id="236" w:name="ref-nicabmBesselVanKolk2013"/>
     <w:p>
       <w:pPr>
         <w:pStyle w:val="Bibliography"/>
@@ -28744,8 +28747,8 @@
         <w:t xml:space="preserve">. YouTube.</w:t>
       </w:r>
     </w:p>
-    <w:bookmarkEnd w:id="235"/>
-    <w:bookmarkStart w:id="236" w:name="ref-nicabmThreeWaysTrauma2014"/>
+    <w:bookmarkEnd w:id="236"/>
+    <w:bookmarkStart w:id="237" w:name="ref-nicabmThreeWaysTrauma2014"/>
     <w:p>
       <w:pPr>
         <w:pStyle w:val="Bibliography"/>
@@ -28767,8 +28770,8 @@
         <w:t xml:space="preserve">. YouTube.</w:t>
       </w:r>
     </w:p>
-    <w:bookmarkEnd w:id="236"/>
-    <w:bookmarkStart w:id="237" w:name="ref-oconnorResearch"/>
+    <w:bookmarkEnd w:id="237"/>
+    <w:bookmarkStart w:id="238" w:name="ref-oconnorResearch"/>
     <w:p>
       <w:pPr>
         <w:pStyle w:val="Bibliography"/>
@@ -28790,8 +28793,8 @@
         <w:t xml:space="preserve">. https://maryfrancesoconnor.org/research.</w:t>
       </w:r>
     </w:p>
-    <w:bookmarkEnd w:id="237"/>
-    <w:bookmarkStart w:id="238" w:name="ref-omegapointWhatAddictionGabor2014"/>
+    <w:bookmarkEnd w:id="238"/>
+    <w:bookmarkStart w:id="239" w:name="ref-omegapointWhatAddictionGabor2014"/>
     <w:p>
       <w:pPr>
         <w:pStyle w:val="Bibliography"/>
@@ -28827,8 +28830,8 @@
         <w:t xml:space="preserve">. YouTube.</w:t>
       </w:r>
     </w:p>
-    <w:bookmarkEnd w:id="238"/>
-    <w:bookmarkStart w:id="239" w:name="ref-prichardWhatLearnedMy2020"/>
+    <w:bookmarkEnd w:id="239"/>
+    <w:bookmarkStart w:id="240" w:name="ref-prichardWhatLearnedMy2020"/>
     <w:p>
       <w:pPr>
         <w:pStyle w:val="Bibliography"/>
@@ -28878,8 +28881,8 @@
         <w:t xml:space="preserve">. YouTube.</w:t>
       </w:r>
     </w:p>
-    <w:bookmarkEnd w:id="239"/>
-    <w:bookmarkStart w:id="240" w:name="ref-realDontWantTalk1997"/>
+    <w:bookmarkEnd w:id="240"/>
+    <w:bookmarkStart w:id="241" w:name="ref-realDontWantTalk1997"/>
     <w:p>
       <w:pPr>
         <w:pStyle w:val="Bibliography"/>
@@ -28929,8 +28932,8 @@
         <w:t xml:space="preserve">. Scribner.</w:t>
       </w:r>
     </w:p>
-    <w:bookmarkEnd w:id="240"/>
-    <w:bookmarkStart w:id="241" w:name="ref-recoverynationRecoveryNation"/>
+    <w:bookmarkEnd w:id="241"/>
+    <w:bookmarkStart w:id="242" w:name="ref-recoverynationRecoveryNation"/>
     <w:p>
       <w:pPr>
         <w:pStyle w:val="Bibliography"/>
@@ -28952,8 +28955,8 @@
         <w:t xml:space="preserve">. https://recoverynation.com/.</w:t>
       </w:r>
     </w:p>
-    <w:bookmarkEnd w:id="241"/>
-    <w:bookmarkStart w:id="242" w:name="X1816b1b3c3b2ab94d1fbedd133ce7956b6e5c70"/>
+    <w:bookmarkEnd w:id="242"/>
+    <w:bookmarkStart w:id="243" w:name="X1816b1b3c3b2ab94d1fbedd133ce7956b6e5c70"/>
     <w:p>
       <w:pPr>
         <w:pStyle w:val="Bibliography"/>
@@ -29042,8 +29045,8 @@
         <w:t xml:space="preserve">(2), 89–105.</w:t>
       </w:r>
     </w:p>
-    <w:bookmarkEnd w:id="242"/>
-    <w:bookmarkStart w:id="243" w:name="ref-smartrecoveryusaWhatSMARTRecovery"/>
+    <w:bookmarkEnd w:id="243"/>
+    <w:bookmarkStart w:id="244" w:name="ref-smartrecoveryusaWhatSMARTRecovery"/>
     <w:p>
       <w:pPr>
         <w:pStyle w:val="Bibliography"/>
@@ -29093,8 +29096,8 @@
         <w:t xml:space="preserve"> https://smartrecovery.org.</w:t>
       </w:r>
     </w:p>
-    <w:bookmarkEnd w:id="243"/>
-    <w:bookmarkStart w:id="244" w:name="X7090878c4462120a55d9afb403a4ac429af65a6"/>
+    <w:bookmarkEnd w:id="244"/>
+    <w:bookmarkStart w:id="245" w:name="X7090878c4462120a55d9afb403a4ac429af65a6"/>
     <w:p>
       <w:pPr>
         <w:pStyle w:val="Bibliography"/>
@@ -29116,8 +29119,8 @@
         <w:t xml:space="preserve">. YouTube.</w:t>
       </w:r>
     </w:p>
-    <w:bookmarkEnd w:id="244"/>
-    <w:bookmarkStart w:id="246" w:name="ref-stillarInfluenceCarerFear2016"/>
+    <w:bookmarkEnd w:id="245"/>
+    <w:bookmarkStart w:id="247" w:name="ref-stillarInfluenceCarerFear2016"/>
     <w:p>
       <w:pPr>
         <w:pStyle w:val="Bibliography"/>
@@ -29154,7 +29157,7 @@
       <w:r>
         <w:t xml:space="preserve"> </w:t>
       </w:r>
-      <w:hyperlink r:id="rId245">
+      <w:hyperlink r:id="rId246">
         <w:r>
           <w:rPr>
             <w:rStyle w:val="Hyperlink"/>
@@ -29163,8 +29166,8 @@
         </w:r>
       </w:hyperlink>
     </w:p>
-    <w:bookmarkEnd w:id="246"/>
-    <w:bookmarkStart w:id="247" w:name="X80446628d4be07f6d11ea65370dd619f81e1b60"/>
+    <w:bookmarkEnd w:id="247"/>
+    <w:bookmarkStart w:id="248" w:name="X80446628d4be07f6d11ea65370dd619f81e1b60"/>
     <w:p>
       <w:pPr>
         <w:pStyle w:val="Bibliography"/>
@@ -29198,8 +29201,8 @@
         <w:t xml:space="preserve">. https://stopabusecampaign.org/take-your-ace-test/.</w:t>
       </w:r>
     </w:p>
-    <w:bookmarkEnd w:id="247"/>
-    <w:bookmarkStart w:id="248" w:name="ref-SuicideRiskDetecting2019"/>
+    <w:bookmarkEnd w:id="248"/>
+    <w:bookmarkStart w:id="249" w:name="ref-SuicideRiskDetecting2019"/>
     <w:p>
       <w:pPr>
         <w:pStyle w:val="Bibliography"/>
@@ -29233,8 +29236,8 @@
         <w:t xml:space="preserve">. https://www.camh.ca/en/professionals/treating-conditions-and-disorders/suicide-risk/suicide—detecting-and-assessing-suicidality.</w:t>
       </w:r>
     </w:p>
-    <w:bookmarkEnd w:id="248"/>
-    <w:bookmarkStart w:id="249" w:name="X9e6ce1dbcf133f89770b19c9e33982c66ab8c78"/>
+    <w:bookmarkEnd w:id="249"/>
+    <w:bookmarkStart w:id="250" w:name="X9e6ce1dbcf133f89770b19c9e33982c66ab8c78"/>
     <w:p>
       <w:pPr>
         <w:pStyle w:val="Bibliography"/>
@@ -29256,8 +29259,8 @@
         <w:t xml:space="preserve">. https://www.artofdyingwell.org/.</w:t>
       </w:r>
     </w:p>
-    <w:bookmarkEnd w:id="249"/>
-    <w:bookmarkStart w:id="250" w:name="ref-thecrisiscentreofb.c.GetSupport"/>
+    <w:bookmarkEnd w:id="250"/>
+    <w:bookmarkStart w:id="251" w:name="ref-thecrisiscentreofb.c.GetSupport"/>
     <w:p>
       <w:pPr>
         <w:pStyle w:val="Bibliography"/>
@@ -29288,8 +29291,8 @@
         <w:t xml:space="preserve">. https://www.crisiscentre.bc.ca/get-support/.</w:t>
       </w:r>
     </w:p>
-    <w:bookmarkEnd w:id="250"/>
-    <w:bookmarkStart w:id="251" w:name="ref-EffectsComplexTrauma"/>
+    <w:bookmarkEnd w:id="251"/>
+    <w:bookmarkStart w:id="252" w:name="ref-EffectsComplexTrauma"/>
     <w:p>
       <w:pPr>
         <w:pStyle w:val="Bibliography"/>
@@ -29311,8 +29314,8 @@
         <w:t xml:space="preserve">. https://www.complextrauma.org/complex-trauma/the-effects-of-complex-trauma-on-brain-development/.</w:t>
       </w:r>
     </w:p>
-    <w:bookmarkEnd w:id="251"/>
-    <w:bookmarkStart w:id="252" w:name="ref-thegoodgrieftrustThingsThatCan2017"/>
+    <w:bookmarkEnd w:id="252"/>
+    <w:bookmarkStart w:id="253" w:name="ref-thegoodgrieftrustThingsThatCan2017"/>
     <w:p>
       <w:pPr>
         <w:pStyle w:val="Bibliography"/>
@@ -29348,8 +29351,8 @@
         <w:t xml:space="preserve">.</w:t>
       </w:r>
     </w:p>
-    <w:bookmarkEnd w:id="252"/>
-    <w:bookmarkStart w:id="253" w:name="ref-thegoodgrieftrustWhatGriefJulia2017"/>
+    <w:bookmarkEnd w:id="253"/>
+    <w:bookmarkStart w:id="254" w:name="ref-thegoodgrieftrustWhatGriefJulia2017"/>
     <w:p>
       <w:pPr>
         <w:pStyle w:val="Bibliography"/>
@@ -29385,8 +29388,8 @@
         <w:t xml:space="preserve">. YouTube.</w:t>
       </w:r>
     </w:p>
-    <w:bookmarkEnd w:id="253"/>
-    <w:bookmarkStart w:id="254" w:name="X6a1954233901c4b86e458c8a2819131b628745c"/>
+    <w:bookmarkEnd w:id="254"/>
+    <w:bookmarkStart w:id="255" w:name="X6a1954233901c4b86e458c8a2819131b628745c"/>
     <w:p>
       <w:pPr>
         <w:pStyle w:val="Bibliography"/>
@@ -29450,8 +29453,8 @@
         <w:t xml:space="preserve">. YouTube.</w:t>
       </w:r>
     </w:p>
-    <w:bookmarkEnd w:id="254"/>
-    <w:bookmarkStart w:id="256" w:name="ref-treasureNovelApproachesTackling2022"/>
+    <w:bookmarkEnd w:id="255"/>
+    <w:bookmarkStart w:id="257" w:name="ref-treasureNovelApproachesTackling2022"/>
     <w:p>
       <w:pPr>
         <w:pStyle w:val="Bibliography"/>
@@ -29488,7 +29491,7 @@
       <w:r>
         <w:t xml:space="preserve"> </w:t>
       </w:r>
-      <w:hyperlink r:id="rId255">
+      <w:hyperlink r:id="rId256">
         <w:r>
           <w:rPr>
             <w:rStyle w:val="Hyperlink"/>
@@ -29497,8 +29500,8 @@
         </w:r>
       </w:hyperlink>
     </w:p>
-    <w:bookmarkEnd w:id="256"/>
-    <w:bookmarkStart w:id="257" w:name="ref-unc-chapelhillCynthiaBulikEating2010"/>
+    <w:bookmarkEnd w:id="257"/>
+    <w:bookmarkStart w:id="258" w:name="ref-unc-chapelhillCynthiaBulikEating2010"/>
     <w:p>
       <w:pPr>
         <w:pStyle w:val="Bibliography"/>
@@ -29548,8 +29551,8 @@
         <w:t xml:space="preserve">. YouTube.</w:t>
       </w:r>
     </w:p>
-    <w:bookmarkEnd w:id="257"/>
-    <w:bookmarkStart w:id="258" w:name="ref-vanderkolkBodyKeepsScore2015"/>
+    <w:bookmarkEnd w:id="258"/>
+    <w:bookmarkStart w:id="259" w:name="ref-vanderkolkBodyKeepsScore2015"/>
     <w:p>
       <w:pPr>
         <w:pStyle w:val="Bibliography"/>
@@ -29592,8 +29595,8 @@
         <w:t xml:space="preserve">. Penguin Books.</w:t>
       </w:r>
     </w:p>
-    <w:bookmarkEnd w:id="258"/>
-    <w:bookmarkStart w:id="260" w:name="ref-vanvelzenRiskFactorsSuicide2023"/>
+    <w:bookmarkEnd w:id="259"/>
+    <w:bookmarkStart w:id="261" w:name="ref-vanvelzenRiskFactorsSuicide2023"/>
     <w:p>
       <w:pPr>
         <w:pStyle w:val="Bibliography"/>
@@ -29630,7 +29633,7 @@
       <w:r>
         <w:t xml:space="preserve"> </w:t>
       </w:r>
-      <w:hyperlink r:id="rId259">
+      <w:hyperlink r:id="rId260">
         <w:r>
           <w:rPr>
             <w:rStyle w:val="Hyperlink"/>
@@ -29639,8 +29642,8 @@
         </w:r>
       </w:hyperlink>
     </w:p>
-    <w:bookmarkEnd w:id="260"/>
-    <w:bookmarkStart w:id="261" w:name="ref-wrightExperiencingGrief2004"/>
+    <w:bookmarkEnd w:id="261"/>
+    <w:bookmarkStart w:id="262" w:name="ref-wrightExperiencingGrief2004"/>
     <w:p>
       <w:pPr>
         <w:pStyle w:val="Bibliography"/>
@@ -29662,8 +29665,8 @@
         <w:t xml:space="preserve">. B&amp;H Books.</w:t>
       </w:r>
     </w:p>
-    <w:bookmarkEnd w:id="261"/>
-    <w:bookmarkStart w:id="262" w:name="ref-yalemedicineHowDepressionAffects2021"/>
+    <w:bookmarkEnd w:id="262"/>
+    <w:bookmarkStart w:id="263" w:name="ref-yalemedicineHowDepressionAffects2021"/>
     <w:p>
       <w:pPr>
         <w:pStyle w:val="Bibliography"/>
@@ -29713,8 +29716,8 @@
         <w:t xml:space="preserve">. YouTube.</w:t>
       </w:r>
     </w:p>
-    <w:bookmarkEnd w:id="262"/>
     <w:bookmarkEnd w:id="263"/>
+    <w:bookmarkEnd w:id="264"/>
     <w:sectPr/>
   </w:body>
 </w:document>

</xml_diff>